<commit_message>
tex2docx: colours in Word (labels, titles, results), embedded Amiri font, 14pt text, plan tables sized to the cell; GE docx rebuilt
Co-Authored-By: Claude Opus 5.5 <noreply@anthropic.com>
Claude-Session: https://claude.ai/code/session_015WVgZKTbSWpZTjn6aZsqC9
</commit_message>
<xml_diff>
--- a/documents/3as_ge/modhakirat/modhakira_wahda1_3as_ge.docx
+++ b/documents/3as_ge/modhakirat/modhakira_wahda1_3as_ge.docx
@@ -342,6 +342,7 @@
               <w:rPr>
                 <w:b/>
                 <w:bCs/>
+                <w:color w:val="1F4E9C"/>
                 <w:rtl/>
               </w:rPr>
               <w:t xml:space="preserve">العناوين</w:t>
@@ -360,6 +361,7 @@
             </w:r>
             <w:r>
               <w:rPr>
+                <w:color w:val="B3261E"/>
                 <w:rtl/>
               </w:rPr>
               <w:t xml:space="preserve">النتائج</w:t>
@@ -368,13 +370,7 @@
               <w:rPr>
                 <w:rtl/>
               </w:rPr>
-              <w:t xml:space="preserve"> </w:t>
-            </w:r>
-            <w:r>
-              <w:rPr>
-                <w:rtl/>
-              </w:rPr>
-              <w:t xml:space="preserve">بلون مختلف ، وكل سؤال في سطر.</w:t>
+              <w:t xml:space="preserve"> بلون مختلف ، وكل سؤال في سطر.</w:t>
             </w:r>
           </w:p>
         </w:tc>
@@ -865,10 +861,10 @@
         <w:tblLook w:firstRow="0" w:lastRow="0" w:firstColumn="0" w:lastColumn="0" w:noHBand="0" w:noVBand="0" w:val="0000"/>
       </w:tblPr>
       <w:tblGrid>
-        <w:gridCol w:w="1084"/>
-        <w:gridCol w:w="591"/>
-        <w:gridCol w:w="7004"/>
-        <w:gridCol w:w="1183"/>
+        <w:gridCol w:w="1281"/>
+        <w:gridCol w:w="690"/>
+        <w:gridCol w:w="6511"/>
+        <w:gridCol w:w="1380"/>
       </w:tblGrid>
       <w:tr>
         <w:tc>
@@ -1138,9 +1134,11 @@
               <w:rPr>
                 <w:b/>
                 <w:bCs/>
-                <w:rtl/>
-              </w:rPr>
-              <w:t xml:space="preserve">[وضعية مقترحة]</w:t>
+                <w:color w:val="FFFFFF"/>
+                <w:shd w:val="clear" w:color="auto" w:fill="C76B00"/>
+                <w:rtl/>
+              </w:rPr>
+              <w:t xml:space="preserve"> وضعية مقترحة </w:t>
             </w:r>
             <w:r>
               <w:rPr>
@@ -1508,9 +1506,11 @@
               <w:rPr>
                 <w:b/>
                 <w:bCs/>
-                <w:rtl/>
-              </w:rPr>
-              <w:t xml:space="preserve">[مناقشة النشاط]</w:t>
+                <w:color w:val="FFFFFF"/>
+                <w:shd w:val="clear" w:color="auto" w:fill="1F4E9C"/>
+                <w:rtl/>
+              </w:rPr>
+              <w:t xml:space="preserve"> مناقشة النشاط </w:t>
             </w:r>
           </w:p>
           <w:p>
@@ -1536,6 +1536,7 @@
               <w:rPr>
                 <w:b/>
                 <w:bCs/>
+                <w:color w:val="1F4E9C"/>
                 <w:rtl/>
               </w:rPr>
               <w:t xml:space="preserve">حساب الحدود:</w:t>
@@ -1690,6 +1691,9 @@
                 <m:t>=</m:t>
               </m:r>
               <m:r>
+                <w:rPr>
+                  <w:color w:val="B3261E"/>
+                </w:rPr>
                 <m:t>1020</m:t>
               </m:r>
             </m:oMath>
@@ -1758,15 +1762,24 @@
                 <m:t>=</m:t>
               </m:r>
               <m:r>
+                <w:rPr>
+                  <w:color w:val="B3261E"/>
+                </w:rPr>
                 <m:t>1040</m:t>
               </m:r>
               <m:r>
                 <m:rPr>
                   <m:sty m:val="p"/>
                 </m:rPr>
+                <w:rPr>
+                  <w:color w:val="B3261E"/>
+                </w:rPr>
                 <m:t>,</m:t>
               </m:r>
               <m:r>
+                <w:rPr>
+                  <w:color w:val="B3261E"/>
+                </w:rPr>
                 <m:t>4</m:t>
               </m:r>
             </m:oMath>
@@ -1844,15 +1857,24 @@
                 <m:t>=</m:t>
               </m:r>
               <m:r>
+                <w:rPr>
+                  <w:color w:val="B3261E"/>
+                </w:rPr>
                 <m:t>1061</m:t>
               </m:r>
               <m:r>
                 <m:rPr>
                   <m:sty m:val="p"/>
                 </m:rPr>
+                <w:rPr>
+                  <w:color w:val="B3261E"/>
+                </w:rPr>
                 <m:t>,</m:t>
               </m:r>
               <m:r>
+                <w:rPr>
+                  <w:color w:val="B3261E"/>
+                </w:rPr>
                 <m:t>208</m:t>
               </m:r>
             </m:oMath>
@@ -1886,6 +1908,7 @@
               <w:rPr>
                 <w:b/>
                 <w:bCs/>
+                <w:color w:val="1F4E9C"/>
                 <w:rtl/>
               </w:rPr>
               <w:t xml:space="preserve">العلاقة بين</w:t>
@@ -1894,6 +1917,7 @@
               <w:rPr>
                 <w:b/>
                 <w:bCs/>
+                <w:color w:val="1F4E9C"/>
                 <w:rtl/>
               </w:rPr>
               <w:t xml:space="preserve"> </w:t>
@@ -1902,20 +1926,40 @@
               <m:sSub>
                 <m:e>
                   <m:r>
+                    <w:rPr>
+                      <w:b/>
+                      <w:bCs/>
+                      <w:color w:val="1F4E9C"/>
+                    </w:rPr>
                     <m:t>u</m:t>
                   </m:r>
                 </m:e>
                 <m:sub>
                   <m:r>
+                    <w:rPr>
+                      <w:b/>
+                      <w:bCs/>
+                      <w:color w:val="1F4E9C"/>
+                    </w:rPr>
                     <m:t>n</m:t>
                   </m:r>
                   <m:r>
                     <m:rPr>
                       <m:sty m:val="p"/>
                     </m:rPr>
+                    <w:rPr>
+                      <w:b/>
+                      <w:bCs/>
+                      <w:color w:val="1F4E9C"/>
+                    </w:rPr>
                     <m:t>+</m:t>
                   </m:r>
                   <m:r>
+                    <w:rPr>
+                      <w:b/>
+                      <w:bCs/>
+                      <w:color w:val="1F4E9C"/>
+                    </w:rPr>
                     <m:t>1</m:t>
                   </m:r>
                 </m:sub>
@@ -1925,6 +1969,7 @@
               <w:rPr>
                 <w:b/>
                 <w:bCs/>
+                <w:color w:val="1F4E9C"/>
                 <w:rtl/>
               </w:rPr>
               <w:t xml:space="preserve"> </w:t>
@@ -1933,6 +1978,7 @@
               <w:rPr>
                 <w:b/>
                 <w:bCs/>
+                <w:color w:val="1F4E9C"/>
                 <w:rtl/>
               </w:rPr>
               <w:t xml:space="preserve">و</w:t>
@@ -1941,6 +1987,7 @@
               <w:rPr>
                 <w:b/>
                 <w:bCs/>
+                <w:color w:val="1F4E9C"/>
                 <w:rtl/>
               </w:rPr>
               <w:t xml:space="preserve"> </w:t>
@@ -1949,11 +1996,21 @@
               <m:sSub>
                 <m:e>
                   <m:r>
+                    <w:rPr>
+                      <w:b/>
+                      <w:bCs/>
+                      <w:color w:val="1F4E9C"/>
+                    </w:rPr>
                     <m:t>u</m:t>
                   </m:r>
                 </m:e>
                 <m:sub>
                   <m:r>
+                    <w:rPr>
+                      <w:b/>
+                      <w:bCs/>
+                      <w:color w:val="1F4E9C"/>
+                    </w:rPr>
                     <m:t>n</m:t>
                   </m:r>
                 </m:sub>
@@ -1963,6 +2020,7 @@
               <w:rPr>
                 <w:b/>
                 <w:bCs/>
+                <w:color w:val="1F4E9C"/>
                 <w:rtl/>
               </w:rPr>
               <w:t xml:space="preserve">:</w:t>
@@ -1989,20 +2047,32 @@
               <m:sSub>
                 <m:e>
                   <m:r>
+                    <w:rPr>
+                      <w:color w:val="B3261E"/>
+                    </w:rPr>
                     <m:t>u</m:t>
                   </m:r>
                 </m:e>
                 <m:sub>
                   <m:r>
+                    <w:rPr>
+                      <w:color w:val="B3261E"/>
+                    </w:rPr>
                     <m:t>n</m:t>
                   </m:r>
                   <m:r>
                     <m:rPr>
                       <m:sty m:val="p"/>
                     </m:rPr>
+                    <w:rPr>
+                      <w:color w:val="B3261E"/>
+                    </w:rPr>
                     <m:t>+</m:t>
                   </m:r>
                   <m:r>
+                    <w:rPr>
+                      <w:color w:val="B3261E"/>
+                    </w:rPr>
                     <m:t>1</m:t>
                   </m:r>
                 </m:sub>
@@ -2011,31 +2081,52 @@
                 <m:rPr>
                   <m:sty m:val="p"/>
                 </m:rPr>
+                <w:rPr>
+                  <w:color w:val="B3261E"/>
+                </w:rPr>
                 <m:t>=</m:t>
               </m:r>
               <m:r>
+                <w:rPr>
+                  <w:color w:val="B3261E"/>
+                </w:rPr>
                 <m:t>1</m:t>
               </m:r>
               <m:r>
                 <m:rPr>
                   <m:sty m:val="p"/>
                 </m:rPr>
+                <w:rPr>
+                  <w:color w:val="B3261E"/>
+                </w:rPr>
                 <m:t>,</m:t>
               </m:r>
               <m:r>
+                <w:rPr>
+                  <w:color w:val="B3261E"/>
+                </w:rPr>
                 <m:t>02</m:t>
               </m:r>
               <m:r>
+                <w:rPr>
+                  <w:color w:val="B3261E"/>
+                </w:rPr>
                 <m:t> </m:t>
               </m:r>
               <m:sSub>
                 <m:e>
                   <m:r>
+                    <w:rPr>
+                      <w:color w:val="B3261E"/>
+                    </w:rPr>
                     <m:t>u</m:t>
                   </m:r>
                 </m:e>
                 <m:sub>
                   <m:r>
+                    <w:rPr>
+                      <w:color w:val="B3261E"/>
+                    </w:rPr>
                     <m:t>n</m:t>
                   </m:r>
                 </m:sub>
@@ -2119,9 +2210,11 @@
               <w:rPr>
                 <w:b/>
                 <w:bCs/>
-                <w:rtl/>
-              </w:rPr>
-              <w:t xml:space="preserve">[تعريف]</w:t>
+                <w:color w:val="FFFFFF"/>
+                <w:shd w:val="clear" w:color="auto" w:fill="1F4E9C"/>
+                <w:rtl/>
+              </w:rPr>
+              <w:t xml:space="preserve"> تعريف </w:t>
             </w:r>
             <w:r>
               <w:rPr>
@@ -2375,9 +2468,11 @@
               <w:rPr>
                 <w:b/>
                 <w:bCs/>
-                <w:rtl/>
-              </w:rPr>
-              <w:t xml:space="preserve">[طرق توليد متتالية]</w:t>
+                <w:color w:val="FFFFFF"/>
+                <w:shd w:val="clear" w:color="auto" w:fill="6A1B9A"/>
+                <w:rtl/>
+              </w:rPr>
+              <w:t xml:space="preserve"> طرق توليد متتالية </w:t>
             </w:r>
           </w:p>
           <w:p>
@@ -2403,6 +2498,7 @@
               <w:rPr>
                 <w:b/>
                 <w:bCs/>
+                <w:color w:val="1F4E9C"/>
                 <w:rtl/>
               </w:rPr>
               <w:t xml:space="preserve">بدستور صريح</w:t>
@@ -2479,6 +2575,7 @@
               <w:rPr>
                 <w:b/>
                 <w:bCs/>
+                <w:color w:val="1F4E9C"/>
                 <w:rtl/>
               </w:rPr>
               <w:t xml:space="preserve">بعلاقة تراجعية</w:t>
@@ -2608,9 +2705,11 @@
               <w:rPr>
                 <w:b/>
                 <w:bCs/>
-                <w:rtl/>
-              </w:rPr>
-              <w:t xml:space="preserve">[مثال 1]</w:t>
+                <w:color w:val="FFFFFF"/>
+                <w:shd w:val="clear" w:color="auto" w:fill="C76B00"/>
+                <w:rtl/>
+              </w:rPr>
+              <w:t xml:space="preserve"> مثال 1 </w:t>
             </w:r>
             <w:r>
               <w:rPr>
@@ -2736,6 +2835,9 @@
                 <m:t>=</m:t>
               </m:r>
               <m:r>
+                <w:rPr>
+                  <w:color w:val="B3261E"/>
+                </w:rPr>
                 <m:t>0</m:t>
               </m:r>
             </m:oMath>
@@ -2798,9 +2900,15 @@
                 <m:rPr>
                   <m:sty m:val="p"/>
                 </m:rPr>
+                <w:rPr>
+                  <w:color w:val="B3261E"/>
+                </w:rPr>
                 <m:t>−</m:t>
               </m:r>
               <m:r>
+                <w:rPr>
+                  <w:color w:val="B3261E"/>
+                </w:rPr>
                 <m:t>3</m:t>
               </m:r>
             </m:oMath>
@@ -2863,9 +2971,15 @@
                 <m:rPr>
                   <m:sty m:val="p"/>
                 </m:rPr>
+                <w:rPr>
+                  <w:color w:val="B3261E"/>
+                </w:rPr>
                 <m:t>−</m:t>
               </m:r>
               <m:r>
+                <w:rPr>
+                  <w:color w:val="B3261E"/>
+                </w:rPr>
                 <m:t>4</m:t>
               </m:r>
             </m:oMath>
@@ -2928,9 +3042,15 @@
                 <m:rPr>
                   <m:sty m:val="p"/>
                 </m:rPr>
+                <w:rPr>
+                  <w:color w:val="B3261E"/>
+                </w:rPr>
                 <m:t>−</m:t>
               </m:r>
               <m:r>
+                <w:rPr>
+                  <w:color w:val="B3261E"/>
+                </w:rPr>
                 <m:t>3</m:t>
               </m:r>
             </m:oMath>
@@ -2993,9 +3113,11 @@
               <w:rPr>
                 <w:b/>
                 <w:bCs/>
-                <w:rtl/>
-              </w:rPr>
-              <w:t xml:space="preserve">[مثال 2]</w:t>
+                <w:color w:val="FFFFFF"/>
+                <w:shd w:val="clear" w:color="auto" w:fill="C76B00"/>
+                <w:rtl/>
+              </w:rPr>
+              <w:t xml:space="preserve"> مثال 2 </w:t>
             </w:r>
             <w:r>
               <w:rPr>
@@ -3192,6 +3314,9 @@
                 <m:t>=</m:t>
               </m:r>
               <m:r>
+                <w:rPr>
+                  <w:color w:val="B3261E"/>
+                </w:rPr>
                 <m:t>3</m:t>
               </m:r>
             </m:oMath>
@@ -3290,6 +3415,9 @@
                 <m:t>=</m:t>
               </m:r>
               <m:r>
+                <w:rPr>
+                  <w:color w:val="B3261E"/>
+                </w:rPr>
                 <m:t>5</m:t>
               </m:r>
             </m:oMath>
@@ -3388,6 +3516,9 @@
                 <m:t>=</m:t>
               </m:r>
               <m:r>
+                <w:rPr>
+                  <w:color w:val="B3261E"/>
+                </w:rPr>
                 <m:t>9</m:t>
               </m:r>
             </m:oMath>
@@ -3451,9 +3582,11 @@
               <w:rPr>
                 <w:b/>
                 <w:bCs/>
-                <w:rtl/>
-              </w:rPr>
-              <w:t xml:space="preserve">[ملاحظات]</w:t>
+                <w:color w:val="FFFFFF"/>
+                <w:shd w:val="clear" w:color="auto" w:fill="2E7D32"/>
+                <w:rtl/>
+              </w:rPr>
+              <w:t xml:space="preserve"> ملاحظات </w:t>
             </w:r>
             <w:r>
               <w:rPr>
@@ -3578,9 +3711,11 @@
               <w:rPr>
                 <w:b/>
                 <w:bCs/>
-                <w:rtl/>
-              </w:rPr>
-              <w:t xml:space="preserve">[حذار]</w:t>
+                <w:color w:val="FFFFFF"/>
+                <w:shd w:val="clear" w:color="auto" w:fill="B3261E"/>
+                <w:rtl/>
+              </w:rPr>
+              <w:t xml:space="preserve"> حذار </w:t>
             </w:r>
             <w:r>
               <w:rPr>
@@ -3717,9 +3852,11 @@
               <w:rPr>
                 <w:b/>
                 <w:bCs/>
-                <w:rtl/>
-              </w:rPr>
-              <w:t xml:space="preserve">[تمرين تطبيقي]</w:t>
+                <w:color w:val="FFFFFF"/>
+                <w:shd w:val="clear" w:color="auto" w:fill="6A1B9A"/>
+                <w:rtl/>
+              </w:rPr>
+              <w:t xml:space="preserve"> تمرين تطبيقي </w:t>
             </w:r>
           </w:p>
           <w:p>
@@ -4329,9 +4466,11 @@
               <w:rPr>
                 <w:b/>
                 <w:bCs/>
-                <w:rtl/>
-              </w:rPr>
-              <w:t xml:space="preserve">[حل التمرين التطبيقي]</w:t>
+                <w:color w:val="FFFFFF"/>
+                <w:shd w:val="clear" w:color="auto" w:fill="C76B00"/>
+                <w:rtl/>
+              </w:rPr>
+              <w:t xml:space="preserve"> حل التمرين التطبيقي </w:t>
             </w:r>
           </w:p>
           <w:p>
@@ -4417,11 +4556,17 @@
                 </m:fPr>
                 <m:num>
                   <m:r>
+                    <w:rPr>
+                      <w:color w:val="B3261E"/>
+                    </w:rPr>
                     <m:t>1</m:t>
                   </m:r>
                 </m:num>
                 <m:den>
                   <m:r>
+                    <w:rPr>
+                      <w:color w:val="B3261E"/>
+                    </w:rPr>
                     <m:t>2</m:t>
                   </m:r>
                 </m:den>
@@ -4523,11 +4668,17 @@
                 </m:fPr>
                 <m:num>
                   <m:r>
+                    <w:rPr>
+                      <w:color w:val="B3261E"/>
+                    </w:rPr>
                     <m:t>3</m:t>
                   </m:r>
                 </m:num>
                 <m:den>
                   <m:r>
+                    <w:rPr>
+                      <w:color w:val="B3261E"/>
+                    </w:rPr>
                     <m:t>4</m:t>
                   </m:r>
                 </m:den>
@@ -4576,11 +4727,17 @@
                 </m:fPr>
                 <m:num>
                   <m:r>
+                    <w:rPr>
+                      <w:color w:val="B3261E"/>
+                    </w:rPr>
                     <m:t>2</m:t>
                   </m:r>
                 </m:num>
                 <m:den>
                   <m:r>
+                    <w:rPr>
+                      <w:color w:val="B3261E"/>
+                    </w:rPr>
                     <m:t>3</m:t>
                   </m:r>
                 </m:den>
@@ -4784,29 +4941,47 @@
                 </m:fPr>
                 <m:num>
                   <m:r>
+                    <w:rPr>
+                      <w:color w:val="B3261E"/>
+                    </w:rPr>
                     <m:t>n</m:t>
                   </m:r>
                   <m:r>
                     <m:rPr>
                       <m:sty m:val="p"/>
                     </m:rPr>
+                    <w:rPr>
+                      <w:color w:val="B3261E"/>
+                    </w:rPr>
                     <m:t>+</m:t>
                   </m:r>
                   <m:r>
+                    <w:rPr>
+                      <w:color w:val="B3261E"/>
+                    </w:rPr>
                     <m:t>2</m:t>
                   </m:r>
                 </m:num>
                 <m:den>
                   <m:r>
+                    <w:rPr>
+                      <w:color w:val="B3261E"/>
+                    </w:rPr>
                     <m:t>n</m:t>
                   </m:r>
                   <m:r>
                     <m:rPr>
                       <m:sty m:val="p"/>
                     </m:rPr>
+                    <w:rPr>
+                      <w:color w:val="B3261E"/>
+                    </w:rPr>
                     <m:t>+</m:t>
                   </m:r>
                   <m:r>
+                    <w:rPr>
+                      <w:color w:val="B3261E"/>
+                    </w:rPr>
                     <m:t>3</m:t>
                   </m:r>
                 </m:den>
@@ -4908,6 +5083,9 @@
                 <m:t>=</m:t>
               </m:r>
               <m:r>
+                <w:rPr>
+                  <w:color w:val="B3261E"/>
+                </w:rPr>
                 <m:t>3</m:t>
               </m:r>
             </m:oMath>
@@ -4999,6 +5177,9 @@
                 <m:t>=</m:t>
               </m:r>
               <m:r>
+                <w:rPr>
+                  <w:color w:val="B3261E"/>
+                </w:rPr>
                 <m:t>8</m:t>
               </m:r>
             </m:oMath>
@@ -5562,10 +5743,10 @@
         <w:tblLook w:firstRow="0" w:lastRow="0" w:firstColumn="0" w:lastColumn="0" w:noHBand="0" w:noVBand="0" w:val="0000"/>
       </w:tblPr>
       <w:tblGrid>
-        <w:gridCol w:w="1084"/>
-        <w:gridCol w:w="591"/>
-        <w:gridCol w:w="7004"/>
-        <w:gridCol w:w="1183"/>
+        <w:gridCol w:w="1281"/>
+        <w:gridCol w:w="690"/>
+        <w:gridCol w:w="6511"/>
+        <w:gridCol w:w="1380"/>
       </w:tblGrid>
       <w:tr>
         <w:tc>
@@ -5858,9 +6039,11 @@
               <w:rPr>
                 <w:b/>
                 <w:bCs/>
-                <w:rtl/>
-              </w:rPr>
-              <w:t xml:space="preserve">[مناقشة النشاط 01 صفحة 6]</w:t>
+                <w:color w:val="FFFFFF"/>
+                <w:shd w:val="clear" w:color="auto" w:fill="C76B00"/>
+                <w:rtl/>
+              </w:rPr>
+              <w:t xml:space="preserve"> مناقشة النشاط 01 صفحة 6 </w:t>
             </w:r>
             <w:r>
               <w:rPr>
@@ -6283,9 +6466,11 @@
               <w:rPr>
                 <w:b/>
                 <w:bCs/>
-                <w:rtl/>
-              </w:rPr>
-              <w:t xml:space="preserve">[مناقشة النشاط]</w:t>
+                <w:color w:val="FFFFFF"/>
+                <w:shd w:val="clear" w:color="auto" w:fill="1F4E9C"/>
+                <w:rtl/>
+              </w:rPr>
+              <w:t xml:space="preserve"> مناقشة النشاط </w:t>
             </w:r>
           </w:p>
           <w:p>
@@ -6345,6 +6530,9 @@
                 <m:t>=</m:t>
               </m:r>
               <m:r>
+                <w:rPr>
+                  <w:color w:val="B3261E"/>
+                </w:rPr>
                 <m:t>31500</m:t>
               </m:r>
             </m:oMath>
@@ -6404,6 +6592,9 @@
                 <m:t>=</m:t>
               </m:r>
               <m:r>
+                <w:rPr>
+                  <w:color w:val="B3261E"/>
+                </w:rPr>
                 <m:t>33000</m:t>
               </m:r>
             </m:oMath>
@@ -6429,20 +6620,32 @@
               <m:sSub>
                 <m:e>
                   <m:r>
+                    <w:rPr>
+                      <w:color w:val="B3261E"/>
+                    </w:rPr>
                     <m:t>u</m:t>
                   </m:r>
                 </m:e>
                 <m:sub>
                   <m:r>
+                    <w:rPr>
+                      <w:color w:val="B3261E"/>
+                    </w:rPr>
                     <m:t>n</m:t>
                   </m:r>
                   <m:r>
                     <m:rPr>
                       <m:sty m:val="p"/>
                     </m:rPr>
+                    <w:rPr>
+                      <w:color w:val="B3261E"/>
+                    </w:rPr>
                     <m:t>+</m:t>
                   </m:r>
                   <m:r>
+                    <w:rPr>
+                      <w:color w:val="B3261E"/>
+                    </w:rPr>
                     <m:t>1</m:t>
                   </m:r>
                 </m:sub>
@@ -6451,16 +6654,25 @@
                 <m:rPr>
                   <m:sty m:val="p"/>
                 </m:rPr>
+                <w:rPr>
+                  <w:color w:val="B3261E"/>
+                </w:rPr>
                 <m:t>=</m:t>
               </m:r>
               <m:sSub>
                 <m:e>
                   <m:r>
+                    <w:rPr>
+                      <w:color w:val="B3261E"/>
+                    </w:rPr>
                     <m:t>u</m:t>
                   </m:r>
                 </m:e>
                 <m:sub>
                   <m:r>
+                    <w:rPr>
+                      <w:color w:val="B3261E"/>
+                    </w:rPr>
                     <m:t>n</m:t>
                   </m:r>
                 </m:sub>
@@ -6469,9 +6681,15 @@
                 <m:rPr>
                   <m:sty m:val="p"/>
                 </m:rPr>
+                <w:rPr>
+                  <w:color w:val="B3261E"/>
+                </w:rPr>
                 <m:t>+</m:t>
               </m:r>
               <m:r>
+                <w:rPr>
+                  <w:color w:val="B3261E"/>
+                </w:rPr>
                 <m:t>1500</m:t>
               </m:r>
             </m:oMath>
@@ -6641,11 +6859,17 @@
               <m:sSub>
                 <m:e>
                   <m:r>
+                    <w:rPr>
+                      <w:color w:val="B3261E"/>
+                    </w:rPr>
                     <m:t>u</m:t>
                   </m:r>
                 </m:e>
                 <m:sub>
                   <m:r>
+                    <w:rPr>
+                      <w:color w:val="B3261E"/>
+                    </w:rPr>
                     <m:t>n</m:t>
                   </m:r>
                 </m:sub>
@@ -6654,21 +6878,36 @@
                 <m:rPr>
                   <m:sty m:val="p"/>
                 </m:rPr>
+                <w:rPr>
+                  <w:color w:val="B3261E"/>
+                </w:rPr>
                 <m:t>=</m:t>
               </m:r>
               <m:r>
+                <w:rPr>
+                  <w:color w:val="B3261E"/>
+                </w:rPr>
                 <m:t>30000</m:t>
               </m:r>
               <m:r>
                 <m:rPr>
                   <m:sty m:val="p"/>
                 </m:rPr>
+                <w:rPr>
+                  <w:color w:val="B3261E"/>
+                </w:rPr>
                 <m:t>+</m:t>
               </m:r>
               <m:r>
+                <w:rPr>
+                  <w:color w:val="B3261E"/>
+                </w:rPr>
                 <m:t>1500</m:t>
               </m:r>
               <m:r>
+                <w:rPr>
+                  <w:color w:val="B3261E"/>
+                </w:rPr>
                 <m:t>n</m:t>
               </m:r>
             </m:oMath>
@@ -6728,6 +6967,9 @@
                 <m:t>=</m:t>
               </m:r>
               <m:r>
+                <w:rPr>
+                  <w:color w:val="B3261E"/>
+                </w:rPr>
                 <m:t>45000</m:t>
               </m:r>
             </m:oMath>
@@ -6809,9 +7051,11 @@
               <w:rPr>
                 <w:b/>
                 <w:bCs/>
-                <w:rtl/>
-              </w:rPr>
-              <w:t xml:space="preserve">[تعريف]</w:t>
+                <w:color w:val="FFFFFF"/>
+                <w:shd w:val="clear" w:color="auto" w:fill="1F4E9C"/>
+                <w:rtl/>
+              </w:rPr>
+              <w:t xml:space="preserve"> تعريف </w:t>
             </w:r>
             <w:r>
               <w:rPr>
@@ -6925,20 +7169,32 @@
               <m:sSub>
                 <m:e>
                   <m:r>
+                    <w:rPr>
+                      <w:color w:val="B3261E"/>
+                    </w:rPr>
                     <m:t>u</m:t>
                   </m:r>
                 </m:e>
                 <m:sub>
                   <m:r>
+                    <w:rPr>
+                      <w:color w:val="B3261E"/>
+                    </w:rPr>
                     <m:t>n</m:t>
                   </m:r>
                   <m:r>
                     <m:rPr>
                       <m:sty m:val="p"/>
                     </m:rPr>
+                    <w:rPr>
+                      <w:color w:val="B3261E"/>
+                    </w:rPr>
                     <m:t>+</m:t>
                   </m:r>
                   <m:r>
+                    <w:rPr>
+                      <w:color w:val="B3261E"/>
+                    </w:rPr>
                     <m:t>1</m:t>
                   </m:r>
                 </m:sub>
@@ -6947,16 +7203,25 @@
                 <m:rPr>
                   <m:sty m:val="p"/>
                 </m:rPr>
+                <w:rPr>
+                  <w:color w:val="B3261E"/>
+                </w:rPr>
                 <m:t>=</m:t>
               </m:r>
               <m:sSub>
                 <m:e>
                   <m:r>
+                    <w:rPr>
+                      <w:color w:val="B3261E"/>
+                    </w:rPr>
                     <m:t>u</m:t>
                   </m:r>
                 </m:e>
                 <m:sub>
                   <m:r>
+                    <w:rPr>
+                      <w:color w:val="B3261E"/>
+                    </w:rPr>
                     <m:t>n</m:t>
                   </m:r>
                 </m:sub>
@@ -6965,9 +7230,15 @@
                 <m:rPr>
                   <m:sty m:val="p"/>
                 </m:rPr>
+                <w:rPr>
+                  <w:color w:val="B3261E"/>
+                </w:rPr>
                 <m:t>+</m:t>
               </m:r>
               <m:r>
+                <w:rPr>
+                  <w:color w:val="B3261E"/>
+                </w:rPr>
                 <m:t>r</m:t>
               </m:r>
             </m:oMath>
@@ -7076,9 +7347,11 @@
               <w:rPr>
                 <w:b/>
                 <w:bCs/>
-                <w:rtl/>
-              </w:rPr>
-              <w:t xml:space="preserve">[إثبات أن متتالية حسابية]</w:t>
+                <w:color w:val="FFFFFF"/>
+                <w:shd w:val="clear" w:color="auto" w:fill="6A1B9A"/>
+                <w:rtl/>
+              </w:rPr>
+              <w:t xml:space="preserve"> إثبات أن متتالية حسابية </w:t>
             </w:r>
             <w:r>
               <w:rPr>
@@ -7216,9 +7489,11 @@
               <w:rPr>
                 <w:b/>
                 <w:bCs/>
-                <w:rtl/>
-              </w:rPr>
-              <w:t xml:space="preserve">[الحد العام]</w:t>
+                <w:color w:val="FFFFFF"/>
+                <w:shd w:val="clear" w:color="auto" w:fill="B3261E"/>
+                <w:rtl/>
+              </w:rPr>
+              <w:t xml:space="preserve"> الحد العام </w:t>
             </w:r>
             <w:r>
               <w:rPr>
@@ -7230,11 +7505,17 @@
               <m:sSub>
                 <m:e>
                   <m:r>
+                    <w:rPr>
+                      <w:color w:val="B3261E"/>
+                    </w:rPr>
                     <m:t>u</m:t>
                   </m:r>
                 </m:e>
                 <m:sub>
                   <m:r>
+                    <w:rPr>
+                      <w:color w:val="B3261E"/>
+                    </w:rPr>
                     <m:t>n</m:t>
                   </m:r>
                 </m:sub>
@@ -7243,16 +7524,25 @@
                 <m:rPr>
                   <m:sty m:val="p"/>
                 </m:rPr>
+                <w:rPr>
+                  <w:color w:val="B3261E"/>
+                </w:rPr>
                 <m:t>=</m:t>
               </m:r>
               <m:sSub>
                 <m:e>
                   <m:r>
+                    <w:rPr>
+                      <w:color w:val="B3261E"/>
+                    </w:rPr>
                     <m:t>u</m:t>
                   </m:r>
                 </m:e>
                 <m:sub>
                   <m:r>
+                    <w:rPr>
+                      <w:color w:val="B3261E"/>
+                    </w:rPr>
                     <m:t>0</m:t>
                   </m:r>
                 </m:sub>
@@ -7261,12 +7551,21 @@
                 <m:rPr>
                   <m:sty m:val="p"/>
                 </m:rPr>
+                <w:rPr>
+                  <w:color w:val="B3261E"/>
+                </w:rPr>
                 <m:t>+</m:t>
               </m:r>
               <m:r>
+                <w:rPr>
+                  <w:color w:val="B3261E"/>
+                </w:rPr>
                 <m:t>n</m:t>
               </m:r>
               <m:r>
+                <w:rPr>
+                  <w:color w:val="B3261E"/>
+                </w:rPr>
                 <m:t>r</m:t>
               </m:r>
             </m:oMath>
@@ -7292,11 +7591,17 @@
               <m:sSub>
                 <m:e>
                   <m:r>
+                    <w:rPr>
+                      <w:color w:val="B3261E"/>
+                    </w:rPr>
                     <m:t>u</m:t>
                   </m:r>
                 </m:e>
                 <m:sub>
                   <m:r>
+                    <w:rPr>
+                      <w:color w:val="B3261E"/>
+                    </w:rPr>
                     <m:t>n</m:t>
                   </m:r>
                 </m:sub>
@@ -7305,16 +7610,25 @@
                 <m:rPr>
                   <m:sty m:val="p"/>
                 </m:rPr>
+                <w:rPr>
+                  <w:color w:val="B3261E"/>
+                </w:rPr>
                 <m:t>=</m:t>
               </m:r>
               <m:sSub>
                 <m:e>
                   <m:r>
+                    <w:rPr>
+                      <w:color w:val="B3261E"/>
+                    </w:rPr>
                     <m:t>u</m:t>
                   </m:r>
                 </m:e>
                 <m:sub>
                   <m:r>
+                    <w:rPr>
+                      <w:color w:val="B3261E"/>
+                    </w:rPr>
                     <m:t>p</m:t>
                   </m:r>
                 </m:sub>
@@ -7323,6 +7637,9 @@
                 <m:rPr>
                   <m:sty m:val="p"/>
                 </m:rPr>
+                <w:rPr>
+                  <w:color w:val="B3261E"/>
+                </w:rPr>
                 <m:t>+</m:t>
               </m:r>
               <m:d>
@@ -7334,20 +7651,32 @@
                 </m:dPr>
                 <m:e>
                   <m:r>
+                    <w:rPr>
+                      <w:color w:val="B3261E"/>
+                    </w:rPr>
                     <m:t>n</m:t>
                   </m:r>
                   <m:r>
                     <m:rPr>
                       <m:sty m:val="p"/>
                     </m:rPr>
+                    <w:rPr>
+                      <w:color w:val="B3261E"/>
+                    </w:rPr>
                     <m:t>−</m:t>
                   </m:r>
                   <m:r>
+                    <w:rPr>
+                      <w:color w:val="B3261E"/>
+                    </w:rPr>
                     <m:t>p</m:t>
                   </m:r>
                 </m:e>
               </m:d>
               <m:r>
+                <w:rPr>
+                  <w:color w:val="B3261E"/>
+                </w:rPr>
                 <m:t>r</m:t>
               </m:r>
             </m:oMath>
@@ -7411,9 +7740,11 @@
               <w:rPr>
                 <w:b/>
                 <w:bCs/>
-                <w:rtl/>
-              </w:rPr>
-              <w:t xml:space="preserve">[البرهان]</w:t>
+                <w:color w:val="FFFFFF"/>
+                <w:shd w:val="clear" w:color="auto" w:fill="6A1B9A"/>
+                <w:rtl/>
+              </w:rPr>
+              <w:t xml:space="preserve"> البرهان </w:t>
             </w:r>
             <w:r>
               <w:rPr>
@@ -7696,9 +8027,11 @@
               <w:rPr>
                 <w:b/>
                 <w:bCs/>
-                <w:rtl/>
-              </w:rPr>
-              <w:t xml:space="preserve">[مجموع حدود متتابعة]</w:t>
+                <w:color w:val="FFFFFF"/>
+                <w:shd w:val="clear" w:color="auto" w:fill="B3261E"/>
+                <w:rtl/>
+              </w:rPr>
+              <w:t xml:space="preserve"> مجموع حدود متتابعة </w:t>
             </w:r>
             <w:r>
               <w:rPr>
@@ -7717,12 +8050,18 @@
                 <m:t>=</m:t>
               </m:r>
               <m:r>
+                <w:rPr>
+                  <w:color w:val="B3261E"/>
+                </w:rPr>
                 <m:t>N</m:t>
               </m:r>
               <m:r>
                 <m:rPr>
                   <m:sty m:val="p"/>
                 </m:rPr>
+                <w:rPr>
+                  <w:color w:val="B3261E"/>
+                </w:rPr>
                 <m:t>×</m:t>
               </m:r>
               <m:f>
@@ -7731,20 +8070,32 @@
                 </m:fPr>
                 <m:num>
                   <m:r>
+                    <w:rPr>
+                      <w:color w:val="B3261E"/>
+                    </w:rPr>
                     <m:t>a</m:t>
                   </m:r>
                   <m:r>
                     <m:rPr>
                       <m:sty m:val="p"/>
                     </m:rPr>
+                    <w:rPr>
+                      <w:color w:val="B3261E"/>
+                    </w:rPr>
                     <m:t>+</m:t>
                   </m:r>
                   <m:r>
+                    <w:rPr>
+                      <w:color w:val="B3261E"/>
+                    </w:rPr>
                     <m:t>b</m:t>
                   </m:r>
                 </m:num>
                 <m:den>
                   <m:r>
+                    <w:rPr>
+                      <w:color w:val="B3261E"/>
+                    </w:rPr>
                     <m:t>2</m:t>
                   </m:r>
                 </m:den>
@@ -7884,9 +8235,11 @@
               <w:rPr>
                 <w:b/>
                 <w:bCs/>
-                <w:rtl/>
-              </w:rPr>
-              <w:t xml:space="preserve">[مثال]</w:t>
+                <w:color w:val="FFFFFF"/>
+                <w:shd w:val="clear" w:color="auto" w:fill="C76B00"/>
+                <w:rtl/>
+              </w:rPr>
+              <w:t xml:space="preserve"> مثال </w:t>
             </w:r>
             <w:r>
               <w:rPr>
@@ -8177,6 +8530,9 @@
                 <m:t>=</m:t>
               </m:r>
               <m:r>
+                <w:rPr>
+                  <w:color w:val="B3261E"/>
+                </w:rPr>
                 <m:t>367500</m:t>
               </m:r>
             </m:oMath>
@@ -8246,9 +8602,11 @@
               <w:rPr>
                 <w:b/>
                 <w:bCs/>
-                <w:rtl/>
-              </w:rPr>
-              <w:t xml:space="preserve">[حذار]</w:t>
+                <w:color w:val="FFFFFF"/>
+                <w:shd w:val="clear" w:color="auto" w:fill="B3261E"/>
+                <w:rtl/>
+              </w:rPr>
+              <w:t xml:space="preserve"> حذار </w:t>
             </w:r>
             <w:r>
               <w:rPr>
@@ -8420,9 +8778,11 @@
               <w:rPr>
                 <w:b/>
                 <w:bCs/>
-                <w:rtl/>
-              </w:rPr>
-              <w:t xml:space="preserve">[تمرين تطبيقي]</w:t>
+                <w:color w:val="FFFFFF"/>
+                <w:shd w:val="clear" w:color="auto" w:fill="6A1B9A"/>
+                <w:rtl/>
+              </w:rPr>
+              <w:t xml:space="preserve"> تمرين تطبيقي </w:t>
             </w:r>
           </w:p>
           <w:p>
@@ -8862,9 +9222,11 @@
               <w:rPr>
                 <w:b/>
                 <w:bCs/>
-                <w:rtl/>
-              </w:rPr>
-              <w:t xml:space="preserve">[حل التمرين التطبيقي]</w:t>
+                <w:color w:val="FFFFFF"/>
+                <w:shd w:val="clear" w:color="auto" w:fill="C76B00"/>
+                <w:rtl/>
+              </w:rPr>
+              <w:t xml:space="preserve"> حل التمرين التطبيقي </w:t>
             </w:r>
           </w:p>
           <w:p>
@@ -9042,15 +9404,24 @@
             </w:r>
             <m:oMath>
               <m:r>
+                <w:rPr>
+                  <w:color w:val="B3261E"/>
+                </w:rPr>
                 <m:t>r</m:t>
               </m:r>
               <m:r>
                 <m:rPr>
                   <m:sty m:val="p"/>
                 </m:rPr>
+                <w:rPr>
+                  <w:color w:val="B3261E"/>
+                </w:rPr>
                 <m:t>=</m:t>
               </m:r>
               <m:r>
+                <w:rPr>
+                  <w:color w:val="B3261E"/>
+                </w:rPr>
                 <m:t>3</m:t>
               </m:r>
             </m:oMath>
@@ -9176,11 +9547,17 @@
               <m:sSub>
                 <m:e>
                   <m:r>
+                    <w:rPr>
+                      <w:color w:val="B3261E"/>
+                    </w:rPr>
                     <m:t>u</m:t>
                   </m:r>
                 </m:e>
                 <m:sub>
                   <m:r>
+                    <w:rPr>
+                      <w:color w:val="B3261E"/>
+                    </w:rPr>
                     <m:t>0</m:t>
                   </m:r>
                 </m:sub>
@@ -9189,9 +9566,15 @@
                 <m:rPr>
                   <m:sty m:val="p"/>
                 </m:rPr>
+                <w:rPr>
+                  <w:color w:val="B3261E"/>
+                </w:rPr>
                 <m:t>=</m:t>
               </m:r>
               <m:r>
+                <w:rPr>
+                  <w:color w:val="B3261E"/>
+                </w:rPr>
                 <m:t>2</m:t>
               </m:r>
             </m:oMath>
@@ -9271,18 +9654,30 @@
                 <m:t>=</m:t>
               </m:r>
               <m:r>
+                <w:rPr>
+                  <w:color w:val="B3261E"/>
+                </w:rPr>
                 <m:t>2</m:t>
               </m:r>
               <m:r>
                 <m:rPr>
                   <m:sty m:val="p"/>
                 </m:rPr>
+                <w:rPr>
+                  <w:color w:val="B3261E"/>
+                </w:rPr>
                 <m:t>+</m:t>
               </m:r>
               <m:r>
+                <w:rPr>
+                  <w:color w:val="B3261E"/>
+                </w:rPr>
                 <m:t>3</m:t>
               </m:r>
               <m:r>
+                <w:rPr>
+                  <w:color w:val="B3261E"/>
+                </w:rPr>
                 <m:t>n</m:t>
               </m:r>
             </m:oMath>
@@ -9463,6 +9858,9 @@
                 <m:t>=</m:t>
               </m:r>
               <m:r>
+                <w:rPr>
+                  <w:color w:val="B3261E"/>
+                </w:rPr>
                 <m:t>260</m:t>
               </m:r>
             </m:oMath>
@@ -10026,10 +10424,10 @@
         <w:tblLook w:firstRow="0" w:lastRow="0" w:firstColumn="0" w:lastColumn="0" w:noHBand="0" w:noVBand="0" w:val="0000"/>
       </w:tblPr>
       <w:tblGrid>
-        <w:gridCol w:w="1084"/>
-        <w:gridCol w:w="591"/>
-        <w:gridCol w:w="7004"/>
-        <w:gridCol w:w="1183"/>
+        <w:gridCol w:w="1281"/>
+        <w:gridCol w:w="690"/>
+        <w:gridCol w:w="6511"/>
+        <w:gridCol w:w="1380"/>
       </w:tblGrid>
       <w:tr>
         <w:tc>
@@ -10328,9 +10726,11 @@
               <w:rPr>
                 <w:b/>
                 <w:bCs/>
-                <w:rtl/>
-              </w:rPr>
-              <w:t xml:space="preserve">[وضعية مقترحة]</w:t>
+                <w:color w:val="FFFFFF"/>
+                <w:shd w:val="clear" w:color="auto" w:fill="C76B00"/>
+                <w:rtl/>
+              </w:rPr>
+              <w:t xml:space="preserve"> وضعية مقترحة </w:t>
             </w:r>
             <w:r>
               <w:rPr>
@@ -10753,9 +11153,11 @@
               <w:rPr>
                 <w:b/>
                 <w:bCs/>
-                <w:rtl/>
-              </w:rPr>
-              <w:t xml:space="preserve">[مناقشة النشاط]</w:t>
+                <w:color w:val="FFFFFF"/>
+                <w:shd w:val="clear" w:color="auto" w:fill="1F4E9C"/>
+                <w:rtl/>
+              </w:rPr>
+              <w:t xml:space="preserve"> مناقشة النشاط </w:t>
             </w:r>
           </w:p>
           <w:p>
@@ -10891,6 +11293,9 @@
                 <m:t>=</m:t>
               </m:r>
               <m:r>
+                <w:rPr>
+                  <w:color w:val="B3261E"/>
+                </w:rPr>
                 <m:t>105000</m:t>
               </m:r>
             </m:oMath>
@@ -10959,6 +11364,9 @@
                 <m:t>=</m:t>
               </m:r>
               <m:r>
+                <w:rPr>
+                  <w:color w:val="B3261E"/>
+                </w:rPr>
                 <m:t>110250</m:t>
               </m:r>
             </m:oMath>
@@ -10984,20 +11392,32 @@
               <m:sSub>
                 <m:e>
                   <m:r>
+                    <w:rPr>
+                      <w:color w:val="B3261E"/>
+                    </w:rPr>
                     <m:t>C</m:t>
                   </m:r>
                 </m:e>
                 <m:sub>
                   <m:r>
+                    <w:rPr>
+                      <w:color w:val="B3261E"/>
+                    </w:rPr>
                     <m:t>n</m:t>
                   </m:r>
                   <m:r>
                     <m:rPr>
                       <m:sty m:val="p"/>
                     </m:rPr>
+                    <w:rPr>
+                      <w:color w:val="B3261E"/>
+                    </w:rPr>
                     <m:t>+</m:t>
                   </m:r>
                   <m:r>
+                    <w:rPr>
+                      <w:color w:val="B3261E"/>
+                    </w:rPr>
                     <m:t>1</m:t>
                   </m:r>
                 </m:sub>
@@ -11006,31 +11426,52 @@
                 <m:rPr>
                   <m:sty m:val="p"/>
                 </m:rPr>
+                <w:rPr>
+                  <w:color w:val="B3261E"/>
+                </w:rPr>
                 <m:t>=</m:t>
               </m:r>
               <m:r>
+                <w:rPr>
+                  <w:color w:val="B3261E"/>
+                </w:rPr>
                 <m:t>1</m:t>
               </m:r>
               <m:r>
                 <m:rPr>
                   <m:sty m:val="p"/>
                 </m:rPr>
+                <w:rPr>
+                  <w:color w:val="B3261E"/>
+                </w:rPr>
                 <m:t>,</m:t>
               </m:r>
               <m:r>
+                <w:rPr>
+                  <w:color w:val="B3261E"/>
+                </w:rPr>
                 <m:t>05</m:t>
               </m:r>
               <m:r>
+                <w:rPr>
+                  <w:color w:val="B3261E"/>
+                </w:rPr>
                 <m:t> </m:t>
               </m:r>
               <m:sSub>
                 <m:e>
                   <m:r>
+                    <w:rPr>
+                      <w:color w:val="B3261E"/>
+                    </w:rPr>
                     <m:t>C</m:t>
                   </m:r>
                 </m:e>
                 <m:sub>
                   <m:r>
+                    <w:rPr>
+                      <w:color w:val="B3261E"/>
+                    </w:rPr>
                     <m:t>n</m:t>
                   </m:r>
                 </m:sub>
@@ -11211,11 +11652,17 @@
               <m:sSub>
                 <m:e>
                   <m:r>
+                    <w:rPr>
+                      <w:color w:val="B3261E"/>
+                    </w:rPr>
                     <m:t>C</m:t>
                   </m:r>
                 </m:e>
                 <m:sub>
                   <m:r>
+                    <w:rPr>
+                      <w:color w:val="B3261E"/>
+                    </w:rPr>
                     <m:t>n</m:t>
                   </m:r>
                 </m:sub>
@@ -11224,34 +11671,55 @@
                 <m:rPr>
                   <m:sty m:val="p"/>
                 </m:rPr>
+                <w:rPr>
+                  <w:color w:val="B3261E"/>
+                </w:rPr>
                 <m:t>=</m:t>
               </m:r>
               <m:r>
+                <w:rPr>
+                  <w:color w:val="B3261E"/>
+                </w:rPr>
                 <m:t>100000</m:t>
               </m:r>
               <m:r>
                 <m:rPr>
                   <m:sty m:val="p"/>
                 </m:rPr>
+                <w:rPr>
+                  <w:color w:val="B3261E"/>
+                </w:rPr>
                 <m:t>×</m:t>
               </m:r>
               <m:r>
+                <w:rPr>
+                  <w:color w:val="B3261E"/>
+                </w:rPr>
                 <m:t>1</m:t>
               </m:r>
               <m:r>
                 <m:rPr>
                   <m:sty m:val="p"/>
                 </m:rPr>
+                <w:rPr>
+                  <w:color w:val="B3261E"/>
+                </w:rPr>
                 <m:t>,</m:t>
               </m:r>
               <m:sSup>
                 <m:e>
                   <m:r>
+                    <w:rPr>
+                      <w:color w:val="B3261E"/>
+                    </w:rPr>
                     <m:t>05</m:t>
                   </m:r>
                 </m:e>
                 <m:sup>
                   <m:r>
+                    <w:rPr>
+                      <w:color w:val="B3261E"/>
+                    </w:rPr>
                     <m:t>n</m:t>
                   </m:r>
                 </m:sup>
@@ -11322,15 +11790,24 @@
                 <m:t>=</m:t>
               </m:r>
               <m:r>
+                <w:rPr>
+                  <w:color w:val="B3261E"/>
+                </w:rPr>
                 <m:t>115762</m:t>
               </m:r>
               <m:r>
                 <m:rPr>
                   <m:sty m:val="p"/>
                 </m:rPr>
+                <w:rPr>
+                  <w:color w:val="B3261E"/>
+                </w:rPr>
                 <m:t>,</m:t>
               </m:r>
               <m:r>
+                <w:rPr>
+                  <w:color w:val="B3261E"/>
+                </w:rPr>
                 <m:t>5</m:t>
               </m:r>
             </m:oMath>
@@ -11412,9 +11889,11 @@
               <w:rPr>
                 <w:b/>
                 <w:bCs/>
-                <w:rtl/>
-              </w:rPr>
-              <w:t xml:space="preserve">[تعريف]</w:t>
+                <w:color w:val="FFFFFF"/>
+                <w:shd w:val="clear" w:color="auto" w:fill="1F4E9C"/>
+                <w:rtl/>
+              </w:rPr>
+              <w:t xml:space="preserve"> تعريف </w:t>
             </w:r>
             <w:r>
               <w:rPr>
@@ -11528,20 +12007,32 @@
               <m:sSub>
                 <m:e>
                   <m:r>
+                    <w:rPr>
+                      <w:color w:val="B3261E"/>
+                    </w:rPr>
                     <m:t>v</m:t>
                   </m:r>
                 </m:e>
                 <m:sub>
                   <m:r>
+                    <w:rPr>
+                      <w:color w:val="B3261E"/>
+                    </w:rPr>
                     <m:t>n</m:t>
                   </m:r>
                   <m:r>
                     <m:rPr>
                       <m:sty m:val="p"/>
                     </m:rPr>
+                    <w:rPr>
+                      <w:color w:val="B3261E"/>
+                    </w:rPr>
                     <m:t>+</m:t>
                   </m:r>
                   <m:r>
+                    <w:rPr>
+                      <w:color w:val="B3261E"/>
+                    </w:rPr>
                     <m:t>1</m:t>
                   </m:r>
                 </m:sub>
@@ -11550,22 +12041,37 @@
                 <m:rPr>
                   <m:sty m:val="p"/>
                 </m:rPr>
+                <w:rPr>
+                  <w:color w:val="B3261E"/>
+                </w:rPr>
                 <m:t>=</m:t>
               </m:r>
               <m:r>
+                <w:rPr>
+                  <w:color w:val="B3261E"/>
+                </w:rPr>
                 <m:t>q</m:t>
               </m:r>
               <m:r>
+                <w:rPr>
+                  <w:color w:val="B3261E"/>
+                </w:rPr>
                 <m:t> </m:t>
               </m:r>
               <m:sSub>
                 <m:e>
                   <m:r>
+                    <w:rPr>
+                      <w:color w:val="B3261E"/>
+                    </w:rPr>
                     <m:t>v</m:t>
                   </m:r>
                 </m:e>
                 <m:sub>
                   <m:r>
+                    <w:rPr>
+                      <w:color w:val="B3261E"/>
+                    </w:rPr>
                     <m:t>n</m:t>
                   </m:r>
                 </m:sub>
@@ -11676,9 +12182,11 @@
               <w:rPr>
                 <w:b/>
                 <w:bCs/>
-                <w:rtl/>
-              </w:rPr>
-              <w:t xml:space="preserve">[إثبات أن متتالية هندسية]</w:t>
+                <w:color w:val="FFFFFF"/>
+                <w:shd w:val="clear" w:color="auto" w:fill="6A1B9A"/>
+                <w:rtl/>
+              </w:rPr>
+              <w:t xml:space="preserve"> إثبات أن متتالية هندسية </w:t>
             </w:r>
             <w:r>
               <w:rPr>
@@ -11884,9 +12392,11 @@
               <w:rPr>
                 <w:b/>
                 <w:bCs/>
-                <w:rtl/>
-              </w:rPr>
-              <w:t xml:space="preserve">[الحد العام]</w:t>
+                <w:color w:val="FFFFFF"/>
+                <w:shd w:val="clear" w:color="auto" w:fill="B3261E"/>
+                <w:rtl/>
+              </w:rPr>
+              <w:t xml:space="preserve"> الحد العام </w:t>
             </w:r>
             <w:r>
               <w:rPr>
@@ -11898,11 +12408,17 @@
               <m:sSub>
                 <m:e>
                   <m:r>
+                    <w:rPr>
+                      <w:color w:val="B3261E"/>
+                    </w:rPr>
                     <m:t>v</m:t>
                   </m:r>
                 </m:e>
                 <m:sub>
                   <m:r>
+                    <w:rPr>
+                      <w:color w:val="B3261E"/>
+                    </w:rPr>
                     <m:t>n</m:t>
                   </m:r>
                 </m:sub>
@@ -11911,31 +12427,49 @@
                 <m:rPr>
                   <m:sty m:val="p"/>
                 </m:rPr>
+                <w:rPr>
+                  <w:color w:val="B3261E"/>
+                </w:rPr>
                 <m:t>=</m:t>
               </m:r>
               <m:sSub>
                 <m:e>
                   <m:r>
+                    <w:rPr>
+                      <w:color w:val="B3261E"/>
+                    </w:rPr>
                     <m:t>v</m:t>
                   </m:r>
                 </m:e>
                 <m:sub>
                   <m:r>
+                    <w:rPr>
+                      <w:color w:val="B3261E"/>
+                    </w:rPr>
                     <m:t>0</m:t>
                   </m:r>
                 </m:sub>
               </m:sSub>
               <m:r>
+                <w:rPr>
+                  <w:color w:val="B3261E"/>
+                </w:rPr>
                 <m:t> </m:t>
               </m:r>
               <m:sSup>
                 <m:e>
                   <m:r>
+                    <w:rPr>
+                      <w:color w:val="B3261E"/>
+                    </w:rPr>
                     <m:t>q</m:t>
                   </m:r>
                 </m:e>
                 <m:sup>
                   <m:r>
+                    <w:rPr>
+                      <w:color w:val="B3261E"/>
+                    </w:rPr>
                     <m:t>n</m:t>
                   </m:r>
                 </m:sup>
@@ -11963,11 +12497,17 @@
               <m:sSub>
                 <m:e>
                   <m:r>
+                    <w:rPr>
+                      <w:color w:val="B3261E"/>
+                    </w:rPr>
                     <m:t>v</m:t>
                   </m:r>
                 </m:e>
                 <m:sub>
                   <m:r>
+                    <w:rPr>
+                      <w:color w:val="B3261E"/>
+                    </w:rPr>
                     <m:t>n</m:t>
                   </m:r>
                 </m:sub>
@@ -11976,40 +12516,64 @@
                 <m:rPr>
                   <m:sty m:val="p"/>
                 </m:rPr>
+                <w:rPr>
+                  <w:color w:val="B3261E"/>
+                </w:rPr>
                 <m:t>=</m:t>
               </m:r>
               <m:sSub>
                 <m:e>
                   <m:r>
+                    <w:rPr>
+                      <w:color w:val="B3261E"/>
+                    </w:rPr>
                     <m:t>v</m:t>
                   </m:r>
                 </m:e>
                 <m:sub>
                   <m:r>
+                    <w:rPr>
+                      <w:color w:val="B3261E"/>
+                    </w:rPr>
                     <m:t>p</m:t>
                   </m:r>
                 </m:sub>
               </m:sSub>
               <m:r>
+                <w:rPr>
+                  <w:color w:val="B3261E"/>
+                </w:rPr>
                 <m:t> </m:t>
               </m:r>
               <m:sSup>
                 <m:e>
                   <m:r>
+                    <w:rPr>
+                      <w:color w:val="B3261E"/>
+                    </w:rPr>
                     <m:t>q</m:t>
                   </m:r>
                 </m:e>
                 <m:sup>
                   <m:r>
+                    <w:rPr>
+                      <w:color w:val="B3261E"/>
+                    </w:rPr>
                     <m:t>n</m:t>
                   </m:r>
                   <m:r>
                     <m:rPr>
                       <m:sty m:val="p"/>
                     </m:rPr>
+                    <w:rPr>
+                      <w:color w:val="B3261E"/>
+                    </w:rPr>
                     <m:t>−</m:t>
                   </m:r>
                   <m:r>
+                    <w:rPr>
+                      <w:color w:val="B3261E"/>
+                    </w:rPr>
                     <m:t>p</m:t>
                   </m:r>
                 </m:sup>
@@ -12075,9 +12639,11 @@
               <w:rPr>
                 <w:b/>
                 <w:bCs/>
-                <w:rtl/>
-              </w:rPr>
-              <w:t xml:space="preserve">[مجموع حدود متتابعة]</w:t>
+                <w:color w:val="FFFFFF"/>
+                <w:shd w:val="clear" w:color="auto" w:fill="B3261E"/>
+                <w:rtl/>
+              </w:rPr>
+              <w:t xml:space="preserve"> مجموع حدود متتابعة </w:t>
             </w:r>
             <w:r>
               <w:rPr>
@@ -12128,12 +12694,18 @@
                 <m:t>=</m:t>
               </m:r>
               <m:r>
+                <w:rPr>
+                  <w:color w:val="B3261E"/>
+                </w:rPr>
                 <m:t>a</m:t>
               </m:r>
               <m:r>
                 <m:rPr>
                   <m:sty m:val="p"/>
                 </m:rPr>
+                <w:rPr>
+                  <w:color w:val="B3261E"/>
+                </w:rPr>
                 <m:t>×</m:t>
               </m:r>
               <m:f>
@@ -12142,22 +12714,34 @@
                 </m:fPr>
                 <m:num>
                   <m:r>
+                    <w:rPr>
+                      <w:color w:val="B3261E"/>
+                    </w:rPr>
                     <m:t>1</m:t>
                   </m:r>
                   <m:r>
                     <m:rPr>
                       <m:sty m:val="p"/>
                     </m:rPr>
+                    <w:rPr>
+                      <w:color w:val="B3261E"/>
+                    </w:rPr>
                     <m:t>−</m:t>
                   </m:r>
                   <m:sSup>
                     <m:e>
                       <m:r>
+                        <w:rPr>
+                          <w:color w:val="B3261E"/>
+                        </w:rPr>
                         <m:t>q</m:t>
                       </m:r>
                     </m:e>
                     <m:sup>
                       <m:r>
+                        <w:rPr>
+                          <w:color w:val="B3261E"/>
+                        </w:rPr>
                         <m:t>N</m:t>
                       </m:r>
                     </m:sup>
@@ -12165,15 +12749,24 @@
                 </m:num>
                 <m:den>
                   <m:r>
+                    <w:rPr>
+                      <w:color w:val="B3261E"/>
+                    </w:rPr>
                     <m:t>1</m:t>
                   </m:r>
                   <m:r>
                     <m:rPr>
                       <m:sty m:val="p"/>
                     </m:rPr>
+                    <w:rPr>
+                      <w:color w:val="B3261E"/>
+                    </w:rPr>
                     <m:t>−</m:t>
                   </m:r>
                   <m:r>
+                    <w:rPr>
+                      <w:color w:val="B3261E"/>
+                    </w:rPr>
                     <m:t>q</m:t>
                   </m:r>
                 </m:den>
@@ -12285,9 +12878,11 @@
               <w:rPr>
                 <w:b/>
                 <w:bCs/>
-                <w:rtl/>
-              </w:rPr>
-              <w:t xml:space="preserve">[ملاحظات]</w:t>
+                <w:color w:val="FFFFFF"/>
+                <w:shd w:val="clear" w:color="auto" w:fill="2E7D32"/>
+                <w:rtl/>
+              </w:rPr>
+              <w:t xml:space="preserve"> ملاحظات </w:t>
             </w:r>
             <w:r>
               <w:rPr>
@@ -12489,9 +13084,11 @@
               <w:rPr>
                 <w:b/>
                 <w:bCs/>
-                <w:rtl/>
-              </w:rPr>
-              <w:t xml:space="preserve">[حذار]</w:t>
+                <w:color w:val="FFFFFF"/>
+                <w:shd w:val="clear" w:color="auto" w:fill="B3261E"/>
+                <w:rtl/>
+              </w:rPr>
+              <w:t xml:space="preserve"> حذار </w:t>
             </w:r>
             <w:r>
               <w:rPr>
@@ -12616,9 +13213,11 @@
               <w:rPr>
                 <w:b/>
                 <w:bCs/>
-                <w:rtl/>
-              </w:rPr>
-              <w:t xml:space="preserve">[تمرين تطبيقي]</w:t>
+                <w:color w:val="FFFFFF"/>
+                <w:shd w:val="clear" w:color="auto" w:fill="6A1B9A"/>
+                <w:rtl/>
+              </w:rPr>
+              <w:t xml:space="preserve"> تمرين تطبيقي </w:t>
             </w:r>
           </w:p>
           <w:p>
@@ -13058,9 +13657,11 @@
               <w:rPr>
                 <w:b/>
                 <w:bCs/>
-                <w:rtl/>
-              </w:rPr>
-              <w:t xml:space="preserve">[حل التمرين التطبيقي]</w:t>
+                <w:color w:val="FFFFFF"/>
+                <w:shd w:val="clear" w:color="auto" w:fill="C76B00"/>
+                <w:rtl/>
+              </w:rPr>
+              <w:t xml:space="preserve"> حل التمرين التطبيقي </w:t>
             </w:r>
           </w:p>
           <w:p>
@@ -13231,15 +13832,24 @@
             </w:r>
             <m:oMath>
               <m:r>
+                <w:rPr>
+                  <w:color w:val="B3261E"/>
+                </w:rPr>
                 <m:t>q</m:t>
               </m:r>
               <m:r>
                 <m:rPr>
                   <m:sty m:val="p"/>
                 </m:rPr>
+                <w:rPr>
+                  <w:color w:val="B3261E"/>
+                </w:rPr>
                 <m:t>=</m:t>
               </m:r>
               <m:r>
+                <w:rPr>
+                  <w:color w:val="B3261E"/>
+                </w:rPr>
                 <m:t>2</m:t>
               </m:r>
             </m:oMath>
@@ -13356,11 +13966,17 @@
               <m:sSub>
                 <m:e>
                   <m:r>
+                    <w:rPr>
+                      <w:color w:val="B3261E"/>
+                    </w:rPr>
                     <m:t>v</m:t>
                   </m:r>
                 </m:e>
                 <m:sub>
                   <m:r>
+                    <w:rPr>
+                      <w:color w:val="B3261E"/>
+                    </w:rPr>
                     <m:t>0</m:t>
                   </m:r>
                 </m:sub>
@@ -13369,9 +13985,15 @@
                 <m:rPr>
                   <m:sty m:val="p"/>
                 </m:rPr>
+                <w:rPr>
+                  <w:color w:val="B3261E"/>
+                </w:rPr>
                 <m:t>=</m:t>
               </m:r>
               <m:r>
+                <w:rPr>
+                  <w:color w:val="B3261E"/>
+                </w:rPr>
                 <m:t>3</m:t>
               </m:r>
             </m:oMath>
@@ -13451,22 +14073,34 @@
                 <m:t>=</m:t>
               </m:r>
               <m:r>
+                <w:rPr>
+                  <w:color w:val="B3261E"/>
+                </w:rPr>
                 <m:t>3</m:t>
               </m:r>
               <m:r>
                 <m:rPr>
                   <m:sty m:val="p"/>
                 </m:rPr>
+                <w:rPr>
+                  <w:color w:val="B3261E"/>
+                </w:rPr>
                 <m:t>×</m:t>
               </m:r>
               <m:sSup>
                 <m:e>
                   <m:r>
+                    <w:rPr>
+                      <w:color w:val="B3261E"/>
+                    </w:rPr>
                     <m:t>2</m:t>
                   </m:r>
                 </m:e>
                 <m:sup>
                   <m:r>
+                    <w:rPr>
+                      <w:color w:val="B3261E"/>
+                    </w:rPr>
                     <m:t>n</m:t>
                   </m:r>
                 </m:sup>
@@ -13646,6 +14280,9 @@
                 <m:t>=</m:t>
               </m:r>
               <m:r>
+                <w:rPr>
+                  <w:color w:val="B3261E"/>
+                </w:rPr>
                 <m:t>189</m:t>
               </m:r>
             </m:oMath>
@@ -14209,10 +14846,10 @@
         <w:tblLook w:firstRow="0" w:lastRow="0" w:firstColumn="0" w:lastColumn="0" w:noHBand="0" w:noVBand="0" w:val="0000"/>
       </w:tblPr>
       <w:tblGrid>
-        <w:gridCol w:w="1084"/>
-        <w:gridCol w:w="591"/>
-        <w:gridCol w:w="7004"/>
-        <w:gridCol w:w="1183"/>
+        <w:gridCol w:w="1281"/>
+        <w:gridCol w:w="690"/>
+        <w:gridCol w:w="6511"/>
+        <w:gridCol w:w="1380"/>
       </w:tblGrid>
       <w:tr>
         <w:tc>
@@ -14436,9 +15073,11 @@
               <w:rPr>
                 <w:b/>
                 <w:bCs/>
-                <w:rtl/>
-              </w:rPr>
-              <w:t xml:space="preserve">[وضعية مقترحة]</w:t>
+                <w:color w:val="FFFFFF"/>
+                <w:shd w:val="clear" w:color="auto" w:fill="C76B00"/>
+                <w:rtl/>
+              </w:rPr>
+              <w:t xml:space="preserve"> وضعية مقترحة </w:t>
             </w:r>
             <w:r>
               <w:rPr>
@@ -14899,9 +15538,11 @@
               <w:rPr>
                 <w:b/>
                 <w:bCs/>
-                <w:rtl/>
-              </w:rPr>
-              <w:t xml:space="preserve">[مناقشة النشاط]</w:t>
+                <w:color w:val="FFFFFF"/>
+                <w:shd w:val="clear" w:color="auto" w:fill="1F4E9C"/>
+                <w:rtl/>
+              </w:rPr>
+              <w:t xml:space="preserve"> مناقشة النشاط </w:t>
             </w:r>
           </w:p>
           <w:p>
@@ -14970,6 +15611,9 @@
                 <m:t>=</m:t>
               </m:r>
               <m:r>
+                <w:rPr>
+                  <w:color w:val="B3261E"/>
+                </w:rPr>
                 <m:t>5</m:t>
               </m:r>
             </m:oMath>
@@ -15038,6 +15682,9 @@
                 <m:t>=</m:t>
               </m:r>
               <m:r>
+                <w:rPr>
+                  <w:color w:val="B3261E"/>
+                </w:rPr>
                 <m:t>11</m:t>
               </m:r>
             </m:oMath>
@@ -15106,6 +15753,9 @@
                 <m:t>=</m:t>
               </m:r>
               <m:r>
+                <w:rPr>
+                  <w:color w:val="B3261E"/>
+                </w:rPr>
                 <m:t>23</m:t>
               </m:r>
             </m:oMath>
@@ -15441,11 +16091,17 @@
               <m:sSub>
                 <m:e>
                   <m:r>
+                    <w:rPr>
+                      <w:color w:val="B3261E"/>
+                    </w:rPr>
                     <m:t>u</m:t>
                   </m:r>
                 </m:e>
                 <m:sub>
                   <m:r>
+                    <w:rPr>
+                      <w:color w:val="B3261E"/>
+                    </w:rPr>
                     <m:t>n</m:t>
                   </m:r>
                 </m:sub>
@@ -15454,25 +16110,40 @@
                 <m:rPr>
                   <m:sty m:val="p"/>
                 </m:rPr>
+                <w:rPr>
+                  <w:color w:val="B3261E"/>
+                </w:rPr>
                 <m:t>=</m:t>
               </m:r>
               <m:r>
+                <w:rPr>
+                  <w:color w:val="B3261E"/>
+                </w:rPr>
                 <m:t>3</m:t>
               </m:r>
               <m:r>
                 <m:rPr>
                   <m:sty m:val="p"/>
                 </m:rPr>
+                <w:rPr>
+                  <w:color w:val="B3261E"/>
+                </w:rPr>
                 <m:t>×</m:t>
               </m:r>
               <m:sSup>
                 <m:e>
                   <m:r>
+                    <w:rPr>
+                      <w:color w:val="B3261E"/>
+                    </w:rPr>
                     <m:t>2</m:t>
                   </m:r>
                 </m:e>
                 <m:sup>
                   <m:r>
+                    <w:rPr>
+                      <w:color w:val="B3261E"/>
+                    </w:rPr>
                     <m:t>n</m:t>
                   </m:r>
                 </m:sup>
@@ -15481,9 +16152,15 @@
                 <m:rPr>
                   <m:sty m:val="p"/>
                 </m:rPr>
+                <w:rPr>
+                  <w:color w:val="B3261E"/>
+                </w:rPr>
                 <m:t>−</m:t>
               </m:r>
               <m:r>
+                <w:rPr>
+                  <w:color w:val="B3261E"/>
+                </w:rPr>
                 <m:t>1</m:t>
               </m:r>
             </m:oMath>
@@ -15558,9 +16235,11 @@
               <w:rPr>
                 <w:b/>
                 <w:bCs/>
-                <w:rtl/>
-              </w:rPr>
-              <w:t xml:space="preserve">[مبدأ الاستدلال بالتراجع]</w:t>
+                <w:color w:val="FFFFFF"/>
+                <w:shd w:val="clear" w:color="auto" w:fill="B3261E"/>
+                <w:rtl/>
+              </w:rPr>
+              <w:t xml:space="preserve"> مبدأ الاستدلال بالتراجع </w:t>
             </w:r>
             <w:r>
               <w:rPr>
@@ -15663,6 +16342,7 @@
               <w:rPr>
                 <w:b/>
                 <w:bCs/>
+                <w:color w:val="1F4E9C"/>
                 <w:rtl/>
               </w:rPr>
               <w:t xml:space="preserve">التحقق:</w:t>
@@ -15748,6 +16428,7 @@
               <w:rPr>
                 <w:b/>
                 <w:bCs/>
+                <w:color w:val="1F4E9C"/>
                 <w:rtl/>
               </w:rPr>
               <w:t xml:space="preserve">الوراثة:</w:t>
@@ -15910,6 +16591,7 @@
               <w:rPr>
                 <w:b/>
                 <w:bCs/>
+                <w:color w:val="1F4E9C"/>
                 <w:rtl/>
               </w:rPr>
               <w:t xml:space="preserve">الخلاصة:</w:t>
@@ -16058,9 +16740,11 @@
               <w:rPr>
                 <w:b/>
                 <w:bCs/>
-                <w:rtl/>
-              </w:rPr>
-              <w:t xml:space="preserve">[مثال]</w:t>
+                <w:color w:val="FFFFFF"/>
+                <w:shd w:val="clear" w:color="auto" w:fill="C76B00"/>
+                <w:rtl/>
+              </w:rPr>
+              <w:t xml:space="preserve"> مثال </w:t>
             </w:r>
             <w:r>
               <w:rPr>
@@ -16176,6 +16860,7 @@
               <w:rPr>
                 <w:b/>
                 <w:bCs/>
+                <w:color w:val="1F4E9C"/>
                 <w:rtl/>
               </w:rPr>
               <w:t xml:space="preserve">التحقق:</w:t>
@@ -16267,6 +16952,7 @@
               <w:rPr>
                 <w:b/>
                 <w:bCs/>
+                <w:color w:val="1F4E9C"/>
                 <w:rtl/>
               </w:rPr>
               <w:t xml:space="preserve">الوراثة:</w:t>
@@ -16528,31 +17214,49 @@
                 <m:t>=</m:t>
               </m:r>
               <m:r>
+                <w:rPr>
+                  <w:color w:val="B3261E"/>
+                </w:rPr>
                 <m:t>3</m:t>
               </m:r>
               <m:r>
                 <m:rPr>
                   <m:sty m:val="p"/>
                 </m:rPr>
+                <w:rPr>
+                  <w:color w:val="B3261E"/>
+                </w:rPr>
                 <m:t>×</m:t>
               </m:r>
               <m:sSup>
                 <m:e>
                   <m:r>
+                    <w:rPr>
+                      <w:color w:val="B3261E"/>
+                    </w:rPr>
                     <m:t>2</m:t>
                   </m:r>
                 </m:e>
                 <m:sup>
                   <m:r>
+                    <w:rPr>
+                      <w:color w:val="B3261E"/>
+                    </w:rPr>
                     <m:t>n</m:t>
                   </m:r>
                   <m:r>
                     <m:rPr>
                       <m:sty m:val="p"/>
                     </m:rPr>
+                    <w:rPr>
+                      <w:color w:val="B3261E"/>
+                    </w:rPr>
                     <m:t>+</m:t>
                   </m:r>
                   <m:r>
+                    <w:rPr>
+                      <w:color w:val="B3261E"/>
+                    </w:rPr>
                     <m:t>1</m:t>
                   </m:r>
                 </m:sup>
@@ -16561,9 +17265,15 @@
                 <m:rPr>
                   <m:sty m:val="p"/>
                 </m:rPr>
+                <w:rPr>
+                  <w:color w:val="B3261E"/>
+                </w:rPr>
                 <m:t>−</m:t>
               </m:r>
               <m:r>
+                <w:rPr>
+                  <w:color w:val="B3261E"/>
+                </w:rPr>
                 <m:t>1</m:t>
               </m:r>
             </m:oMath>
@@ -16583,6 +17293,7 @@
               <w:rPr>
                 <w:b/>
                 <w:bCs/>
+                <w:color w:val="1F4E9C"/>
                 <w:rtl/>
               </w:rPr>
               <w:t xml:space="preserve">الخلاصة:</w:t>
@@ -16726,9 +17437,11 @@
               <w:rPr>
                 <w:b/>
                 <w:bCs/>
-                <w:rtl/>
-              </w:rPr>
-              <w:t xml:space="preserve">[حذار]</w:t>
+                <w:color w:val="FFFFFF"/>
+                <w:shd w:val="clear" w:color="auto" w:fill="B3261E"/>
+                <w:rtl/>
+              </w:rPr>
+              <w:t xml:space="preserve"> حذار </w:t>
             </w:r>
             <w:r>
               <w:rPr>
@@ -16801,9 +17514,11 @@
               <w:rPr>
                 <w:b/>
                 <w:bCs/>
-                <w:rtl/>
-              </w:rPr>
-              <w:t xml:space="preserve">[تمرين تطبيقي]</w:t>
+                <w:color w:val="FFFFFF"/>
+                <w:shd w:val="clear" w:color="auto" w:fill="6A1B9A"/>
+                <w:rtl/>
+              </w:rPr>
+              <w:t xml:space="preserve"> تمرين تطبيقي </w:t>
             </w:r>
           </w:p>
           <w:p>
@@ -17095,9 +17810,11 @@
               <w:rPr>
                 <w:b/>
                 <w:bCs/>
-                <w:rtl/>
-              </w:rPr>
-              <w:t xml:space="preserve">[حل التمرين التطبيقي]</w:t>
+                <w:color w:val="FFFFFF"/>
+                <w:shd w:val="clear" w:color="auto" w:fill="C76B00"/>
+                <w:rtl/>
+              </w:rPr>
+              <w:t xml:space="preserve"> حل التمرين التطبيقي </w:t>
             </w:r>
           </w:p>
           <w:p>
@@ -17123,6 +17840,7 @@
               <w:rPr>
                 <w:b/>
                 <w:bCs/>
+                <w:color w:val="1F4E9C"/>
                 <w:rtl/>
               </w:rPr>
               <w:t xml:space="preserve">التحقق:</w:t>
@@ -17222,6 +17940,7 @@
               <w:rPr>
                 <w:b/>
                 <w:bCs/>
+                <w:color w:val="1F4E9C"/>
                 <w:rtl/>
               </w:rPr>
               <w:t xml:space="preserve">الوراثة:</w:t>
@@ -17436,20 +18155,32 @@
               <m:sSup>
                 <m:e>
                   <m:r>
+                    <w:rPr>
+                      <w:color w:val="B3261E"/>
+                    </w:rPr>
                     <m:t>2</m:t>
                   </m:r>
                 </m:e>
                 <m:sup>
                   <m:r>
+                    <w:rPr>
+                      <w:color w:val="B3261E"/>
+                    </w:rPr>
                     <m:t>n</m:t>
                   </m:r>
                   <m:r>
                     <m:rPr>
                       <m:sty m:val="p"/>
                     </m:rPr>
+                    <w:rPr>
+                      <w:color w:val="B3261E"/>
+                    </w:rPr>
                     <m:t>+</m:t>
                   </m:r>
                   <m:r>
+                    <w:rPr>
+                      <w:color w:val="B3261E"/>
+                    </w:rPr>
                     <m:t>1</m:t>
                   </m:r>
                 </m:sup>
@@ -17458,6 +18189,9 @@
                 <m:rPr>
                   <m:sty m:val="p"/>
                 </m:rPr>
+                <w:rPr>
+                  <w:color w:val="B3261E"/>
+                </w:rPr>
                 <m:t>≥</m:t>
               </m:r>
               <m:d>
@@ -17469,15 +18203,24 @@
                 </m:dPr>
                 <m:e>
                   <m:r>
+                    <w:rPr>
+                      <w:color w:val="B3261E"/>
+                    </w:rPr>
                     <m:t>n</m:t>
                   </m:r>
                   <m:r>
                     <m:rPr>
                       <m:sty m:val="p"/>
                     </m:rPr>
+                    <w:rPr>
+                      <w:color w:val="B3261E"/>
+                    </w:rPr>
                     <m:t>+</m:t>
                   </m:r>
                   <m:r>
+                    <w:rPr>
+                      <w:color w:val="B3261E"/>
+                    </w:rPr>
                     <m:t>1</m:t>
                   </m:r>
                 </m:e>
@@ -17486,9 +18229,15 @@
                 <m:rPr>
                   <m:sty m:val="p"/>
                 </m:rPr>
+                <w:rPr>
+                  <w:color w:val="B3261E"/>
+                </w:rPr>
                 <m:t>+</m:t>
               </m:r>
               <m:r>
+                <w:rPr>
+                  <w:color w:val="B3261E"/>
+                </w:rPr>
                 <m:t>1</m:t>
               </m:r>
             </m:oMath>
@@ -17508,6 +18257,7 @@
               <w:rPr>
                 <w:b/>
                 <w:bCs/>
+                <w:color w:val="1F4E9C"/>
                 <w:rtl/>
               </w:rPr>
               <w:t xml:space="preserve">الخلاصة:</w:t>
@@ -17616,6 +18366,7 @@
               <w:rPr>
                 <w:b/>
                 <w:bCs/>
+                <w:color w:val="1F4E9C"/>
                 <w:rtl/>
               </w:rPr>
               <w:t xml:space="preserve">التحقق:</w:t>
@@ -17709,6 +18460,7 @@
               <w:rPr>
                 <w:b/>
                 <w:bCs/>
+                <w:color w:val="1F4E9C"/>
                 <w:rtl/>
               </w:rPr>
               <w:t xml:space="preserve">الوراثة:</w:t>
@@ -18056,15 +18808,24 @@
                     </m:dPr>
                     <m:e>
                       <m:r>
+                        <w:rPr>
+                          <w:color w:val="B3261E"/>
+                        </w:rPr>
                         <m:t>n</m:t>
                       </m:r>
                       <m:r>
                         <m:rPr>
                           <m:sty m:val="p"/>
                         </m:rPr>
+                        <w:rPr>
+                          <w:color w:val="B3261E"/>
+                        </w:rPr>
                         <m:t>+</m:t>
                       </m:r>
                       <m:r>
+                        <w:rPr>
+                          <w:color w:val="B3261E"/>
+                        </w:rPr>
                         <m:t>1</m:t>
                       </m:r>
                     </m:e>
@@ -18086,15 +18847,24 @@
                         </m:dPr>
                         <m:e>
                           <m:r>
+                            <w:rPr>
+                              <w:color w:val="B3261E"/>
+                            </w:rPr>
                             <m:t>n</m:t>
                           </m:r>
                           <m:r>
                             <m:rPr>
                               <m:sty m:val="p"/>
                             </m:rPr>
+                            <w:rPr>
+                              <w:color w:val="B3261E"/>
+                            </w:rPr>
                             <m:t>+</m:t>
                           </m:r>
                           <m:r>
+                            <w:rPr>
+                              <w:color w:val="B3261E"/>
+                            </w:rPr>
                             <m:t>1</m:t>
                           </m:r>
                         </m:e>
@@ -18103,9 +18873,15 @@
                         <m:rPr>
                           <m:sty m:val="p"/>
                         </m:rPr>
+                        <w:rPr>
+                          <w:color w:val="B3261E"/>
+                        </w:rPr>
                         <m:t>+</m:t>
                       </m:r>
                       <m:r>
+                        <w:rPr>
+                          <w:color w:val="B3261E"/>
+                        </w:rPr>
                         <m:t>1</m:t>
                       </m:r>
                     </m:e>
@@ -18113,6 +18889,9 @@
                 </m:num>
                 <m:den>
                   <m:r>
+                    <w:rPr>
+                      <w:color w:val="B3261E"/>
+                    </w:rPr>
                     <m:t>2</m:t>
                   </m:r>
                 </m:den>
@@ -18134,6 +18913,7 @@
               <w:rPr>
                 <w:b/>
                 <w:bCs/>
+                <w:color w:val="1F4E9C"/>
                 <w:rtl/>
               </w:rPr>
               <w:t xml:space="preserve">الخلاصة:</w:t>
@@ -18730,10 +19510,10 @@
         <w:tblLook w:firstRow="0" w:lastRow="0" w:firstColumn="0" w:lastColumn="0" w:noHBand="0" w:noVBand="0" w:val="0000"/>
       </w:tblPr>
       <w:tblGrid>
-        <w:gridCol w:w="1084"/>
-        <w:gridCol w:w="591"/>
-        <w:gridCol w:w="7004"/>
-        <w:gridCol w:w="1183"/>
+        <w:gridCol w:w="1281"/>
+        <w:gridCol w:w="690"/>
+        <w:gridCol w:w="6511"/>
+        <w:gridCol w:w="1380"/>
       </w:tblGrid>
       <w:tr>
         <w:tc>
@@ -19036,9 +19816,11 @@
               <w:rPr>
                 <w:b/>
                 <w:bCs/>
-                <w:rtl/>
-              </w:rPr>
-              <w:t xml:space="preserve">[وضعية مقترحة]</w:t>
+                <w:color w:val="FFFFFF"/>
+                <w:shd w:val="clear" w:color="auto" w:fill="C76B00"/>
+                <w:rtl/>
+              </w:rPr>
+              <w:t xml:space="preserve"> وضعية مقترحة </w:t>
             </w:r>
             <w:r>
               <w:rPr>
@@ -19478,9 +20260,11 @@
               <w:rPr>
                 <w:b/>
                 <w:bCs/>
-                <w:rtl/>
-              </w:rPr>
-              <w:t xml:space="preserve">[مناقشة النشاط]</w:t>
+                <w:color w:val="FFFFFF"/>
+                <w:shd w:val="clear" w:color="auto" w:fill="1F4E9C"/>
+                <w:rtl/>
+              </w:rPr>
+              <w:t xml:space="preserve"> مناقشة النشاط </w:t>
             </w:r>
           </w:p>
           <w:p>
@@ -19648,11 +20432,17 @@
               <m:sSub>
                 <m:e>
                   <m:r>
+                    <w:rPr>
+                      <w:color w:val="B3261E"/>
+                    </w:rPr>
                     <m:t>v</m:t>
                   </m:r>
                 </m:e>
                 <m:sub>
                   <m:r>
+                    <w:rPr>
+                      <w:color w:val="B3261E"/>
+                    </w:rPr>
                     <m:t>n</m:t>
                   </m:r>
                 </m:sub>
@@ -19845,22 +20635,34 @@
             </w:r>
             <m:oMath>
               <m:r>
+                <w:rPr>
+                  <w:color w:val="B3261E"/>
+                </w:rPr>
                 <m:t>1</m:t>
               </m:r>
               <m:r>
                 <m:rPr>
                   <m:sty m:val="p"/>
                 </m:rPr>
+                <w:rPr>
+                  <w:color w:val="B3261E"/>
+                </w:rPr>
                 <m:t>≤</m:t>
               </m:r>
               <m:sSub>
                 <m:e>
                   <m:r>
+                    <w:rPr>
+                      <w:color w:val="B3261E"/>
+                    </w:rPr>
                     <m:t>v</m:t>
                   </m:r>
                 </m:e>
                 <m:sub>
                   <m:r>
+                    <w:rPr>
+                      <w:color w:val="B3261E"/>
+                    </w:rPr>
                     <m:t>n</m:t>
                   </m:r>
                 </m:sub>
@@ -19869,9 +20671,15 @@
                 <m:rPr>
                   <m:sty m:val="p"/>
                 </m:rPr>
+                <w:rPr>
+                  <w:color w:val="B3261E"/>
+                </w:rPr>
                 <m:t>&lt;</m:t>
               </m:r>
               <m:r>
+                <w:rPr>
+                  <w:color w:val="B3261E"/>
+                </w:rPr>
                 <m:t>2</m:t>
               </m:r>
             </m:oMath>
@@ -20117,6 +20925,7 @@
             </w:r>
             <w:r>
               <w:rPr>
+                <w:color w:val="B3261E"/>
                 <w:rtl/>
               </w:rPr>
               <w:t xml:space="preserve">متزايدة تماماً</w:t>
@@ -20192,9 +21001,11 @@
               <w:rPr>
                 <w:b/>
                 <w:bCs/>
-                <w:rtl/>
-              </w:rPr>
-              <w:t xml:space="preserve">[تعريف]</w:t>
+                <w:color w:val="FFFFFF"/>
+                <w:shd w:val="clear" w:color="auto" w:fill="1F4E9C"/>
+                <w:rtl/>
+              </w:rPr>
+              <w:t xml:space="preserve"> تعريف </w:t>
             </w:r>
           </w:p>
           <w:p>
@@ -20629,9 +21440,11 @@
               <w:rPr>
                 <w:b/>
                 <w:bCs/>
-                <w:rtl/>
-              </w:rPr>
-              <w:t xml:space="preserve">[دراسة اتجاه التغير]</w:t>
+                <w:color w:val="FFFFFF"/>
+                <w:shd w:val="clear" w:color="auto" w:fill="6A1B9A"/>
+                <w:rtl/>
+              </w:rPr>
+              <w:t xml:space="preserve"> دراسة اتجاه التغير </w:t>
             </w:r>
           </w:p>
           <w:p>
@@ -21020,9 +21833,11 @@
               <w:rPr>
                 <w:b/>
                 <w:bCs/>
-                <w:rtl/>
-              </w:rPr>
-              <w:t xml:space="preserve">[مثال]</w:t>
+                <w:color w:val="FFFFFF"/>
+                <w:shd w:val="clear" w:color="auto" w:fill="C76B00"/>
+                <w:rtl/>
+              </w:rPr>
+              <w:t xml:space="preserve"> مثال </w:t>
             </w:r>
             <w:r>
               <w:rPr>
@@ -21152,6 +21967,7 @@
               <w:rPr>
                 <w:b/>
                 <w:bCs/>
+                <w:color w:val="1F4E9C"/>
                 <w:rtl/>
               </w:rPr>
               <w:t xml:space="preserve">الحصر بالتراجع:</w:t>
@@ -21388,22 +22204,34 @@
             </w:r>
             <m:oMath>
               <m:r>
+                <w:rPr>
+                  <w:color w:val="B3261E"/>
+                </w:rPr>
                 <m:t>0</m:t>
               </m:r>
               <m:r>
                 <m:rPr>
                   <m:sty m:val="p"/>
                 </m:rPr>
+                <w:rPr>
+                  <w:color w:val="B3261E"/>
+                </w:rPr>
                 <m:t>≤</m:t>
               </m:r>
               <m:sSub>
                 <m:e>
                   <m:r>
+                    <w:rPr>
+                      <w:color w:val="B3261E"/>
+                    </w:rPr>
                     <m:t>u</m:t>
                   </m:r>
                 </m:e>
                 <m:sub>
                   <m:r>
+                    <w:rPr>
+                      <w:color w:val="B3261E"/>
+                    </w:rPr>
                     <m:t>n</m:t>
                   </m:r>
                 </m:sub>
@@ -21412,9 +22240,15 @@
                 <m:rPr>
                   <m:sty m:val="p"/>
                 </m:rPr>
+                <w:rPr>
+                  <w:color w:val="B3261E"/>
+                </w:rPr>
                 <m:t>&lt;</m:t>
               </m:r>
               <m:r>
+                <w:rPr>
+                  <w:color w:val="B3261E"/>
+                </w:rPr>
                 <m:t>2</m:t>
               </m:r>
             </m:oMath>
@@ -21434,6 +22268,7 @@
               <w:rPr>
                 <w:b/>
                 <w:bCs/>
+                <w:color w:val="1F4E9C"/>
                 <w:rtl/>
               </w:rPr>
               <w:t xml:space="preserve">الرتابة:</w:t>
@@ -21660,6 +22495,7 @@
             </w:r>
             <w:r>
               <w:rPr>
+                <w:color w:val="B3261E"/>
                 <w:rtl/>
               </w:rPr>
               <w:t xml:space="preserve">متزايدة تماماً</w:t>
@@ -21724,9 +22560,11 @@
               <w:rPr>
                 <w:b/>
                 <w:bCs/>
-                <w:rtl/>
-              </w:rPr>
-              <w:t xml:space="preserve">[حذار]</w:t>
+                <w:color w:val="FFFFFF"/>
+                <w:shd w:val="clear" w:color="auto" w:fill="B3261E"/>
+                <w:rtl/>
+              </w:rPr>
+              <w:t xml:space="preserve"> حذار </w:t>
             </w:r>
             <w:r>
               <w:rPr>
@@ -21799,9 +22637,11 @@
               <w:rPr>
                 <w:b/>
                 <w:bCs/>
-                <w:rtl/>
-              </w:rPr>
-              <w:t xml:space="preserve">[تمرين تطبيقي]</w:t>
+                <w:color w:val="FFFFFF"/>
+                <w:shd w:val="clear" w:color="auto" w:fill="6A1B9A"/>
+                <w:rtl/>
+              </w:rPr>
+              <w:t xml:space="preserve"> تمرين تطبيقي </w:t>
             </w:r>
           </w:p>
           <w:p>
@@ -22218,9 +23058,11 @@
               <w:rPr>
                 <w:b/>
                 <w:bCs/>
-                <w:rtl/>
-              </w:rPr>
-              <w:t xml:space="preserve">[حل التمرين التطبيقي]</w:t>
+                <w:color w:val="FFFFFF"/>
+                <w:shd w:val="clear" w:color="auto" w:fill="C76B00"/>
+                <w:rtl/>
+              </w:rPr>
+              <w:t xml:space="preserve"> حل التمرين التطبيقي </w:t>
             </w:r>
           </w:p>
           <w:p>
@@ -22328,11 +23170,17 @@
               <m:sSub>
                 <m:e>
                   <m:r>
+                    <w:rPr>
+                      <w:color w:val="B3261E"/>
+                    </w:rPr>
                     <m:t>w</m:t>
                   </m:r>
                 </m:e>
                 <m:sub>
                   <m:r>
+                    <w:rPr>
+                      <w:color w:val="B3261E"/>
+                    </w:rPr>
                     <m:t>n</m:t>
                   </m:r>
                 </m:sub>
@@ -22341,9 +23189,15 @@
                 <m:rPr>
                   <m:sty m:val="p"/>
                 </m:rPr>
+                <w:rPr>
+                  <w:color w:val="B3261E"/>
+                </w:rPr>
                 <m:t>&gt;</m:t>
               </m:r>
               <m:r>
+                <w:rPr>
+                  <w:color w:val="B3261E"/>
+                </w:rPr>
                 <m:t>0</m:t>
               </m:r>
             </m:oMath>
@@ -22515,6 +23369,9 @@
                 </m:fPr>
                 <m:num>
                   <m:r>
+                    <w:rPr>
+                      <w:color w:val="B3261E"/>
+                    </w:rPr>
                     <m:t>3</m:t>
                   </m:r>
                   <m:d>
@@ -22526,15 +23383,24 @@
                     </m:dPr>
                     <m:e>
                       <m:r>
+                        <w:rPr>
+                          <w:color w:val="B3261E"/>
+                        </w:rPr>
                         <m:t>n</m:t>
                       </m:r>
                       <m:r>
                         <m:rPr>
                           <m:sty m:val="p"/>
                         </m:rPr>
+                        <w:rPr>
+                          <w:color w:val="B3261E"/>
+                        </w:rPr>
                         <m:t>+</m:t>
                       </m:r>
                       <m:r>
+                        <w:rPr>
+                          <w:color w:val="B3261E"/>
+                        </w:rPr>
                         <m:t>1</m:t>
                       </m:r>
                     </m:e>
@@ -22542,15 +23408,24 @@
                 </m:num>
                 <m:den>
                   <m:r>
+                    <w:rPr>
+                      <w:color w:val="B3261E"/>
+                    </w:rPr>
                     <m:t>n</m:t>
                   </m:r>
                   <m:r>
                     <m:rPr>
                       <m:sty m:val="p"/>
                     </m:rPr>
+                    <w:rPr>
+                      <w:color w:val="B3261E"/>
+                    </w:rPr>
                     <m:t>+</m:t>
                   </m:r>
                   <m:r>
+                    <w:rPr>
+                      <w:color w:val="B3261E"/>
+                    </w:rPr>
                     <m:t>2</m:t>
                   </m:r>
                 </m:den>
@@ -22768,6 +23643,7 @@
             </w:r>
             <w:r>
               <w:rPr>
+                <w:color w:val="B3261E"/>
                 <w:rtl/>
               </w:rPr>
               <w:t xml:space="preserve">متزايدة تماماً</w:t>
@@ -23332,10 +24208,10 @@
         <w:tblLook w:firstRow="0" w:lastRow="0" w:firstColumn="0" w:lastColumn="0" w:noHBand="0" w:noVBand="0" w:val="0000"/>
       </w:tblPr>
       <w:tblGrid>
-        <w:gridCol w:w="1084"/>
-        <w:gridCol w:w="591"/>
-        <w:gridCol w:w="7004"/>
-        <w:gridCol w:w="1183"/>
+        <w:gridCol w:w="1281"/>
+        <w:gridCol w:w="690"/>
+        <w:gridCol w:w="6511"/>
+        <w:gridCol w:w="1380"/>
       </w:tblGrid>
       <w:tr>
         <w:tc>
@@ -23617,9 +24493,11 @@
               <w:rPr>
                 <w:b/>
                 <w:bCs/>
-                <w:rtl/>
-              </w:rPr>
-              <w:t xml:space="preserve">[وضعية مقترحة]</w:t>
+                <w:color w:val="FFFFFF"/>
+                <w:shd w:val="clear" w:color="auto" w:fill="C76B00"/>
+                <w:rtl/>
+              </w:rPr>
+              <w:t xml:space="preserve"> وضعية مقترحة </w:t>
             </w:r>
           </w:p>
           <w:p>
@@ -23960,9 +24838,11 @@
               <w:rPr>
                 <w:b/>
                 <w:bCs/>
-                <w:rtl/>
-              </w:rPr>
-              <w:t xml:space="preserve">[مناقشة النشاط]</w:t>
+                <w:color w:val="FFFFFF"/>
+                <w:shd w:val="clear" w:color="auto" w:fill="1F4E9C"/>
+                <w:rtl/>
+              </w:rPr>
+              <w:t xml:space="preserve"> مناقشة النشاط </w:t>
             </w:r>
           </w:p>
           <w:p>
@@ -24157,22 +25037,34 @@
             </w:r>
             <m:oMath>
               <m:r>
+                <w:rPr>
+                  <w:color w:val="B3261E"/>
+                </w:rPr>
                 <m:t>1</m:t>
               </m:r>
               <m:r>
                 <m:rPr>
                   <m:sty m:val="p"/>
                 </m:rPr>
+                <w:rPr>
+                  <w:color w:val="B3261E"/>
+                </w:rPr>
                 <m:t>,</m:t>
               </m:r>
               <m:sSup>
                 <m:e>
                   <m:r>
+                    <w:rPr>
+                      <w:color w:val="B3261E"/>
+                    </w:rPr>
                     <m:t>05</m:t>
                   </m:r>
                 </m:e>
                 <m:sup>
                   <m:r>
+                    <w:rPr>
+                      <w:color w:val="B3261E"/>
+                    </w:rPr>
                     <m:t>n</m:t>
                   </m:r>
                 </m:sup>
@@ -24181,18 +25073,27 @@
                 <m:rPr>
                   <m:sty m:val="p"/>
                 </m:rPr>
+                <w:rPr>
+                  <w:color w:val="B3261E"/>
+                </w:rPr>
                 <m:t>→</m:t>
               </m:r>
               <m:r>
                 <m:rPr>
                   <m:sty m:val="p"/>
                 </m:rPr>
+                <w:rPr>
+                  <w:color w:val="B3261E"/>
+                </w:rPr>
                 <m:t>+</m:t>
               </m:r>
               <m:r>
                 <m:rPr>
                   <m:sty m:val="p"/>
                 </m:rPr>
+                <w:rPr>
+                  <w:color w:val="B3261E"/>
+                </w:rPr>
                 <m:t>∞</m:t>
               </m:r>
             </m:oMath>
@@ -24359,22 +25260,34 @@
             </w:r>
             <m:oMath>
               <m:r>
+                <w:rPr>
+                  <w:color w:val="B3261E"/>
+                </w:rPr>
                 <m:t>0</m:t>
               </m:r>
               <m:r>
                 <m:rPr>
                   <m:sty m:val="p"/>
                 </m:rPr>
+                <w:rPr>
+                  <w:color w:val="B3261E"/>
+                </w:rPr>
                 <m:t>,</m:t>
               </m:r>
               <m:sSup>
                 <m:e>
                   <m:r>
+                    <w:rPr>
+                      <w:color w:val="B3261E"/>
+                    </w:rPr>
                     <m:t>8</m:t>
                   </m:r>
                 </m:e>
                 <m:sup>
                   <m:r>
+                    <w:rPr>
+                      <w:color w:val="B3261E"/>
+                    </w:rPr>
                     <m:t>n</m:t>
                   </m:r>
                 </m:sup>
@@ -24383,9 +25296,15 @@
                 <m:rPr>
                   <m:sty m:val="p"/>
                 </m:rPr>
+                <w:rPr>
+                  <w:color w:val="B3261E"/>
+                </w:rPr>
                 <m:t>→</m:t>
               </m:r>
               <m:r>
+                <w:rPr>
+                  <w:color w:val="B3261E"/>
+                </w:rPr>
                 <m:t>0</m:t>
               </m:r>
             </m:oMath>
@@ -24460,9 +25379,11 @@
               <w:rPr>
                 <w:b/>
                 <w:bCs/>
-                <w:rtl/>
-              </w:rPr>
-              <w:t xml:space="preserve">[خاصية]</w:t>
+                <w:color w:val="FFFFFF"/>
+                <w:shd w:val="clear" w:color="auto" w:fill="B3261E"/>
+                <w:rtl/>
+              </w:rPr>
+              <w:t xml:space="preserve"> خاصية </w:t>
             </w:r>
           </w:p>
           <w:p>
@@ -24513,12 +25434,18 @@
                 <m:rPr>
                   <m:sty m:val="p"/>
                 </m:rPr>
+                <w:rPr>
+                  <w:color w:val="B3261E"/>
+                </w:rPr>
                 <m:t>+</m:t>
               </m:r>
               <m:r>
                 <m:rPr>
                   <m:sty m:val="p"/>
                 </m:rPr>
+                <w:rPr>
+                  <w:color w:val="B3261E"/>
+                </w:rPr>
                 <m:t>∞</m:t>
               </m:r>
             </m:oMath>
@@ -24598,6 +25525,9 @@
                 <m:t>=</m:t>
               </m:r>
               <m:r>
+                <w:rPr>
+                  <w:color w:val="B3261E"/>
+                </w:rPr>
                 <m:t>0</m:t>
               </m:r>
             </m:oMath>
@@ -24823,16 +25753,25 @@
                 <m:rPr>
                   <m:sty m:val="p"/>
                 </m:rPr>
+                <w:rPr>
+                  <w:color w:val="B3261E"/>
+                </w:rPr>
                 <m:t>lim</m:t>
               </m:r>
               <m:sSub>
                 <m:e>
                   <m:r>
+                    <w:rPr>
+                      <w:color w:val="B3261E"/>
+                    </w:rPr>
                     <m:t>u</m:t>
                   </m:r>
                 </m:e>
                 <m:sub>
                   <m:r>
+                    <w:rPr>
+                      <w:color w:val="B3261E"/>
+                    </w:rPr>
                     <m:t>n</m:t>
                   </m:r>
                 </m:sub>
@@ -24841,9 +25780,15 @@
                 <m:rPr>
                   <m:sty m:val="p"/>
                 </m:rPr>
+                <w:rPr>
+                  <w:color w:val="B3261E"/>
+                </w:rPr>
                 <m:t>=</m:t>
               </m:r>
               <m:r>
+                <w:rPr>
+                  <w:color w:val="B3261E"/>
+                </w:rPr>
                 <m:t>l</m:t>
               </m:r>
             </m:oMath>
@@ -24967,9 +25912,11 @@
               <w:rPr>
                 <w:b/>
                 <w:bCs/>
-                <w:rtl/>
-              </w:rPr>
-              <w:t xml:space="preserve">[تعريف]</w:t>
+                <w:color w:val="FFFFFF"/>
+                <w:shd w:val="clear" w:color="auto" w:fill="1F4E9C"/>
+                <w:rtl/>
+              </w:rPr>
+              <w:t xml:space="preserve"> تعريف </w:t>
             </w:r>
             <w:r>
               <w:rPr>
@@ -25130,9 +26077,11 @@
               <w:rPr>
                 <w:b/>
                 <w:bCs/>
-                <w:rtl/>
-              </w:rPr>
-              <w:t xml:space="preserve">[مثال 1]</w:t>
+                <w:color w:val="FFFFFF"/>
+                <w:shd w:val="clear" w:color="auto" w:fill="C76B00"/>
+                <w:rtl/>
+              </w:rPr>
+              <w:t xml:space="preserve"> مثال 1 </w:t>
             </w:r>
             <w:r>
               <w:rPr>
@@ -25220,6 +26169,9 @@
                 <m:t>=</m:t>
               </m:r>
               <m:r>
+                <w:rPr>
+                  <w:color w:val="B3261E"/>
+                </w:rPr>
                 <m:t>3</m:t>
               </m:r>
             </m:oMath>
@@ -25306,9 +26258,11 @@
               <w:rPr>
                 <w:b/>
                 <w:bCs/>
-                <w:rtl/>
-              </w:rPr>
-              <w:t xml:space="preserve">[مثال 2]</w:t>
+                <w:color w:val="FFFFFF"/>
+                <w:shd w:val="clear" w:color="auto" w:fill="C76B00"/>
+                <w:rtl/>
+              </w:rPr>
+              <w:t xml:space="preserve"> مثال 2 </w:t>
             </w:r>
             <w:r>
               <w:rPr>
@@ -25497,6 +26451,9 @@
                 <m:t>=</m:t>
               </m:r>
               <m:r>
+                <w:rPr>
+                  <w:color w:val="B3261E"/>
+                </w:rPr>
                 <m:t>5</m:t>
               </m:r>
             </m:oMath>
@@ -25560,9 +26517,11 @@
               <w:rPr>
                 <w:b/>
                 <w:bCs/>
-                <w:rtl/>
-              </w:rPr>
-              <w:t xml:space="preserve">[حذار]</w:t>
+                <w:color w:val="FFFFFF"/>
+                <w:shd w:val="clear" w:color="auto" w:fill="B3261E"/>
+                <w:rtl/>
+              </w:rPr>
+              <w:t xml:space="preserve"> حذار </w:t>
             </w:r>
             <w:r>
               <w:rPr>
@@ -25677,9 +26636,11 @@
               <w:rPr>
                 <w:b/>
                 <w:bCs/>
-                <w:rtl/>
-              </w:rPr>
-              <w:t xml:space="preserve">[تمرين تطبيقي]</w:t>
+                <w:color w:val="FFFFFF"/>
+                <w:shd w:val="clear" w:color="auto" w:fill="6A1B9A"/>
+                <w:rtl/>
+              </w:rPr>
+              <w:t xml:space="preserve"> تمرين تطبيقي </w:t>
             </w:r>
           </w:p>
           <w:p>
@@ -26000,9 +26961,11 @@
               <w:rPr>
                 <w:b/>
                 <w:bCs/>
-                <w:rtl/>
-              </w:rPr>
-              <w:t xml:space="preserve">[حل التمرين التطبيقي]</w:t>
+                <w:color w:val="FFFFFF"/>
+                <w:shd w:val="clear" w:color="auto" w:fill="C76B00"/>
+                <w:rtl/>
+              </w:rPr>
+              <w:t xml:space="preserve"> حل التمرين التطبيقي </w:t>
             </w:r>
           </w:p>
           <w:p>
@@ -26062,6 +27025,9 @@
                 <m:t>=</m:t>
               </m:r>
               <m:r>
+                <w:rPr>
+                  <w:color w:val="B3261E"/>
+                </w:rPr>
                 <m:t>1200</m:t>
               </m:r>
             </m:oMath>
@@ -26121,6 +27087,9 @@
                 <m:t>=</m:t>
               </m:r>
               <m:r>
+                <w:rPr>
+                  <w:color w:val="B3261E"/>
+                </w:rPr>
                 <m:t>1100</m:t>
               </m:r>
             </m:oMath>
@@ -26276,6 +27245,9 @@
                 <m:t>=</m:t>
               </m:r>
               <m:r>
+                <w:rPr>
+                  <w:color w:val="B3261E"/>
+                </w:rPr>
                 <m:t>200</m:t>
               </m:r>
             </m:oMath>
@@ -26992,10 +27964,10 @@
         <w:tblLook w:firstRow="0" w:lastRow="0" w:firstColumn="0" w:lastColumn="0" w:noHBand="0" w:noVBand="0" w:val="0000"/>
       </w:tblPr>
       <w:tblGrid>
-        <w:gridCol w:w="1084"/>
-        <w:gridCol w:w="591"/>
-        <w:gridCol w:w="7004"/>
-        <w:gridCol w:w="1183"/>
+        <w:gridCol w:w="1281"/>
+        <w:gridCol w:w="690"/>
+        <w:gridCol w:w="6511"/>
+        <w:gridCol w:w="1380"/>
       </w:tblGrid>
       <w:tr>
         <w:tc>
@@ -27242,9 +28214,11 @@
               <w:rPr>
                 <w:b/>
                 <w:bCs/>
-                <w:rtl/>
-              </w:rPr>
-              <w:t xml:space="preserve">[مناقشة النشاط 04 صفحة 7]</w:t>
+                <w:color w:val="FFFFFF"/>
+                <w:shd w:val="clear" w:color="auto" w:fill="C76B00"/>
+                <w:rtl/>
+              </w:rPr>
+              <w:t xml:space="preserve"> مناقشة النشاط 04 صفحة 7 </w:t>
             </w:r>
             <w:r>
               <w:rPr>
@@ -27819,9 +28793,11 @@
               <w:rPr>
                 <w:b/>
                 <w:bCs/>
-                <w:rtl/>
-              </w:rPr>
-              <w:t xml:space="preserve">[مناقشة النشاط]</w:t>
+                <w:color w:val="FFFFFF"/>
+                <w:shd w:val="clear" w:color="auto" w:fill="1F4E9C"/>
+                <w:rtl/>
+              </w:rPr>
+              <w:t xml:space="preserve"> مناقشة النشاط </w:t>
             </w:r>
           </w:p>
           <w:p>
@@ -27890,15 +28866,24 @@
                 <m:t>=</m:t>
               </m:r>
               <m:r>
+                <w:rPr>
+                  <w:color w:val="B3261E"/>
+                </w:rPr>
                 <m:t>3</m:t>
               </m:r>
               <m:r>
                 <m:rPr>
                   <m:sty m:val="p"/>
                 </m:rPr>
+                <w:rPr>
+                  <w:color w:val="B3261E"/>
+                </w:rPr>
                 <m:t>,</m:t>
               </m:r>
               <m:r>
+                <w:rPr>
+                  <w:color w:val="B3261E"/>
+                </w:rPr>
                 <m:t>5</m:t>
               </m:r>
             </m:oMath>
@@ -27967,15 +28952,24 @@
                 <m:t>=</m:t>
               </m:r>
               <m:r>
+                <w:rPr>
+                  <w:color w:val="B3261E"/>
+                </w:rPr>
                 <m:t>4</m:t>
               </m:r>
               <m:r>
                 <m:rPr>
                   <m:sty m:val="p"/>
                 </m:rPr>
+                <w:rPr>
+                  <w:color w:val="B3261E"/>
+                </w:rPr>
                 <m:t>,</m:t>
               </m:r>
               <m:r>
+                <w:rPr>
+                  <w:color w:val="B3261E"/>
+                </w:rPr>
                 <m:t>75</m:t>
               </m:r>
             </m:oMath>
@@ -28044,15 +29038,24 @@
                 <m:t>=</m:t>
               </m:r>
               <m:r>
+                <w:rPr>
+                  <w:color w:val="B3261E"/>
+                </w:rPr>
                 <m:t>5</m:t>
               </m:r>
               <m:r>
                 <m:rPr>
                   <m:sty m:val="p"/>
                 </m:rPr>
+                <w:rPr>
+                  <w:color w:val="B3261E"/>
+                </w:rPr>
                 <m:t>,</m:t>
               </m:r>
               <m:r>
+                <w:rPr>
+                  <w:color w:val="B3261E"/>
+                </w:rPr>
                 <m:t>375</m:t>
               </m:r>
             </m:oMath>
@@ -28175,15 +29178,24 @@
             </w:r>
             <m:oMath>
               <m:r>
+                <w:rPr>
+                  <w:color w:val="B3261E"/>
+                </w:rPr>
                 <m:t>l</m:t>
               </m:r>
               <m:r>
                 <m:rPr>
                   <m:sty m:val="p"/>
                 </m:rPr>
+                <w:rPr>
+                  <w:color w:val="B3261E"/>
+                </w:rPr>
                 <m:t>=</m:t>
               </m:r>
               <m:r>
+                <w:rPr>
+                  <w:color w:val="B3261E"/>
+                </w:rPr>
                 <m:t>6</m:t>
               </m:r>
             </m:oMath>
@@ -28414,28 +29426,46 @@
                 <m:t>=</m:t>
               </m:r>
               <m:r>
+                <w:rPr>
+                  <w:color w:val="B3261E"/>
+                </w:rPr>
                 <m:t>0</m:t>
               </m:r>
               <m:r>
                 <m:rPr>
                   <m:sty m:val="p"/>
                 </m:rPr>
+                <w:rPr>
+                  <w:color w:val="B3261E"/>
+                </w:rPr>
                 <m:t>,</m:t>
               </m:r>
               <m:r>
+                <w:rPr>
+                  <w:color w:val="B3261E"/>
+                </w:rPr>
                 <m:t>5</m:t>
               </m:r>
               <m:r>
+                <w:rPr>
+                  <w:color w:val="B3261E"/>
+                </w:rPr>
                 <m:t> </m:t>
               </m:r>
               <m:sSub>
                 <m:e>
                   <m:r>
+                    <w:rPr>
+                      <w:color w:val="B3261E"/>
+                    </w:rPr>
                     <m:t>v</m:t>
                   </m:r>
                 </m:e>
                 <m:sub>
                   <m:r>
+                    <w:rPr>
+                      <w:color w:val="B3261E"/>
+                    </w:rPr>
                     <m:t>n</m:t>
                   </m:r>
                 </m:sub>
@@ -28622,11 +29652,17 @@
               <m:sSub>
                 <m:e>
                   <m:r>
+                    <w:rPr>
+                      <w:color w:val="B3261E"/>
+                    </w:rPr>
                     <m:t>u</m:t>
                   </m:r>
                 </m:e>
                 <m:sub>
                   <m:r>
+                    <w:rPr>
+                      <w:color w:val="B3261E"/>
+                    </w:rPr>
                     <m:t>n</m:t>
                   </m:r>
                 </m:sub>
@@ -28635,43 +29671,70 @@
                 <m:rPr>
                   <m:sty m:val="p"/>
                 </m:rPr>
+                <w:rPr>
+                  <w:color w:val="B3261E"/>
+                </w:rPr>
                 <m:t>=</m:t>
               </m:r>
               <m:r>
+                <w:rPr>
+                  <w:color w:val="B3261E"/>
+                </w:rPr>
                 <m:t>6</m:t>
               </m:r>
               <m:r>
                 <m:rPr>
                   <m:sty m:val="p"/>
                 </m:rPr>
+                <w:rPr>
+                  <w:color w:val="B3261E"/>
+                </w:rPr>
                 <m:t>−</m:t>
               </m:r>
               <m:r>
+                <w:rPr>
+                  <w:color w:val="B3261E"/>
+                </w:rPr>
                 <m:t>5</m:t>
               </m:r>
               <m:r>
                 <m:rPr>
                   <m:sty m:val="p"/>
                 </m:rPr>
+                <w:rPr>
+                  <w:color w:val="B3261E"/>
+                </w:rPr>
                 <m:t>×</m:t>
               </m:r>
               <m:r>
+                <w:rPr>
+                  <w:color w:val="B3261E"/>
+                </w:rPr>
                 <m:t>0</m:t>
               </m:r>
               <m:r>
                 <m:rPr>
                   <m:sty m:val="p"/>
                 </m:rPr>
+                <w:rPr>
+                  <w:color w:val="B3261E"/>
+                </w:rPr>
                 <m:t>,</m:t>
               </m:r>
               <m:sSup>
                 <m:e>
                   <m:r>
+                    <w:rPr>
+                      <w:color w:val="B3261E"/>
+                    </w:rPr>
                     <m:t>5</m:t>
                   </m:r>
                 </m:e>
                 <m:sup>
                   <m:r>
+                    <w:rPr>
+                      <w:color w:val="B3261E"/>
+                    </w:rPr>
                     <m:t>n</m:t>
                   </m:r>
                 </m:sup>
@@ -28750,16 +29813,25 @@
                 <m:rPr>
                   <m:sty m:val="p"/>
                 </m:rPr>
+                <w:rPr>
+                  <w:color w:val="B3261E"/>
+                </w:rPr>
                 <m:t>lim</m:t>
               </m:r>
               <m:sSub>
                 <m:e>
                   <m:r>
+                    <w:rPr>
+                      <w:color w:val="B3261E"/>
+                    </w:rPr>
                     <m:t>u</m:t>
                   </m:r>
                 </m:e>
                 <m:sub>
                   <m:r>
+                    <w:rPr>
+                      <w:color w:val="B3261E"/>
+                    </w:rPr>
                     <m:t>n</m:t>
                   </m:r>
                 </m:sub>
@@ -28768,9 +29840,15 @@
                 <m:rPr>
                   <m:sty m:val="p"/>
                 </m:rPr>
+                <w:rPr>
+                  <w:color w:val="B3261E"/>
+                </w:rPr>
                 <m:t>=</m:t>
               </m:r>
               <m:r>
+                <w:rPr>
+                  <w:color w:val="B3261E"/>
+                </w:rPr>
                 <m:t>6</m:t>
               </m:r>
             </m:oMath>
@@ -28845,9 +29923,11 @@
               <w:rPr>
                 <w:b/>
                 <w:bCs/>
-                <w:rtl/>
-              </w:rPr>
-              <w:t xml:space="preserve">[طريقة]</w:t>
+                <w:color w:val="FFFFFF"/>
+                <w:shd w:val="clear" w:color="auto" w:fill="6A1B9A"/>
+                <w:rtl/>
+              </w:rPr>
+              <w:t xml:space="preserve"> طريقة </w:t>
             </w:r>
             <w:r>
               <w:rPr>
@@ -29275,11 +30355,17 @@
               <m:sSub>
                 <m:e>
                   <m:r>
+                    <w:rPr>
+                      <w:color w:val="B3261E"/>
+                    </w:rPr>
                     <m:t>u</m:t>
                   </m:r>
                 </m:e>
                 <m:sub>
                   <m:r>
+                    <w:rPr>
+                      <w:color w:val="B3261E"/>
+                    </w:rPr>
                     <m:t>n</m:t>
                   </m:r>
                 </m:sub>
@@ -29288,40 +30374,64 @@
                 <m:rPr>
                   <m:sty m:val="p"/>
                 </m:rPr>
+                <w:rPr>
+                  <w:color w:val="B3261E"/>
+                </w:rPr>
                 <m:t>=</m:t>
               </m:r>
               <m:r>
+                <w:rPr>
+                  <w:color w:val="B3261E"/>
+                </w:rPr>
                 <m:t>l</m:t>
               </m:r>
               <m:r>
                 <m:rPr>
                   <m:sty m:val="p"/>
                 </m:rPr>
+                <w:rPr>
+                  <w:color w:val="B3261E"/>
+                </w:rPr>
                 <m:t>+</m:t>
               </m:r>
               <m:sSub>
                 <m:e>
                   <m:r>
+                    <w:rPr>
+                      <w:color w:val="B3261E"/>
+                    </w:rPr>
                     <m:t>v</m:t>
                   </m:r>
                 </m:e>
                 <m:sub>
                   <m:r>
+                    <w:rPr>
+                      <w:color w:val="B3261E"/>
+                    </w:rPr>
                     <m:t>0</m:t>
                   </m:r>
                 </m:sub>
               </m:sSub>
               <m:r>
+                <w:rPr>
+                  <w:color w:val="B3261E"/>
+                </w:rPr>
                 <m:t> </m:t>
               </m:r>
               <m:sSup>
                 <m:e>
                   <m:r>
+                    <w:rPr>
+                      <w:color w:val="B3261E"/>
+                    </w:rPr>
                     <m:t>a</m:t>
                   </m:r>
                 </m:e>
                 <m:sup>
                   <m:r>
+                    <w:rPr>
+                      <w:color w:val="B3261E"/>
+                    </w:rPr>
                     <m:t>n</m:t>
                   </m:r>
                 </m:sup>
@@ -29401,9 +30511,11 @@
               <w:rPr>
                 <w:b/>
                 <w:bCs/>
-                <w:rtl/>
-              </w:rPr>
-              <w:t xml:space="preserve">[حذار]</w:t>
+                <w:color w:val="FFFFFF"/>
+                <w:shd w:val="clear" w:color="auto" w:fill="B3261E"/>
+                <w:rtl/>
+              </w:rPr>
+              <w:t xml:space="preserve"> حذار </w:t>
             </w:r>
             <w:r>
               <w:rPr>
@@ -29553,9 +30665,11 @@
               <w:rPr>
                 <w:b/>
                 <w:bCs/>
-                <w:rtl/>
-              </w:rPr>
-              <w:t xml:space="preserve">[تمرين تطبيقي]</w:t>
+                <w:color w:val="FFFFFF"/>
+                <w:shd w:val="clear" w:color="auto" w:fill="6A1B9A"/>
+                <w:rtl/>
+              </w:rPr>
+              <w:t xml:space="preserve"> تمرين تطبيقي </w:t>
             </w:r>
           </w:p>
           <w:p>
@@ -30087,9 +31201,11 @@
               <w:rPr>
                 <w:b/>
                 <w:bCs/>
-                <w:rtl/>
-              </w:rPr>
-              <w:t xml:space="preserve">[حل التمرين التطبيقي]</w:t>
+                <w:color w:val="FFFFFF"/>
+                <w:shd w:val="clear" w:color="auto" w:fill="C76B00"/>
+                <w:rtl/>
+              </w:rPr>
+              <w:t xml:space="preserve"> حل التمرين التطبيقي </w:t>
             </w:r>
           </w:p>
           <w:p>
@@ -30186,15 +31302,24 @@
             </w:r>
             <m:oMath>
               <m:r>
+                <w:rPr>
+                  <w:color w:val="B3261E"/>
+                </w:rPr>
                 <m:t>l</m:t>
               </m:r>
               <m:r>
                 <m:rPr>
                   <m:sty m:val="p"/>
                 </m:rPr>
+                <w:rPr>
+                  <w:color w:val="B3261E"/>
+                </w:rPr>
                 <m:t>=</m:t>
               </m:r>
               <m:r>
+                <w:rPr>
+                  <w:color w:val="B3261E"/>
+                </w:rPr>
                 <m:t>2</m:t>
               </m:r>
             </m:oMath>
@@ -30398,16 +31523,25 @@
                 <m:t>=</m:t>
               </m:r>
               <m:r>
+                <w:rPr>
+                  <w:color w:val="B3261E"/>
+                </w:rPr>
                 <m:t>3</m:t>
               </m:r>
               <m:sSub>
                 <m:e>
                   <m:r>
+                    <w:rPr>
+                      <w:color w:val="B3261E"/>
+                    </w:rPr>
                     <m:t>v</m:t>
                   </m:r>
                 </m:e>
                 <m:sub>
                   <m:r>
+                    <w:rPr>
+                      <w:color w:val="B3261E"/>
+                    </w:rPr>
                     <m:t>n</m:t>
                   </m:r>
                 </m:sub>
@@ -30569,11 +31703,17 @@
               <m:sSub>
                 <m:e>
                   <m:r>
+                    <w:rPr>
+                      <w:color w:val="B3261E"/>
+                    </w:rPr>
                     <m:t>u</m:t>
                   </m:r>
                 </m:e>
                 <m:sub>
                   <m:r>
+                    <w:rPr>
+                      <w:color w:val="B3261E"/>
+                    </w:rPr>
                     <m:t>n</m:t>
                   </m:r>
                 </m:sub>
@@ -30582,25 +31722,40 @@
                 <m:rPr>
                   <m:sty m:val="p"/>
                 </m:rPr>
+                <w:rPr>
+                  <w:color w:val="B3261E"/>
+                </w:rPr>
                 <m:t>=</m:t>
               </m:r>
               <m:r>
+                <w:rPr>
+                  <w:color w:val="B3261E"/>
+                </w:rPr>
                 <m:t>2</m:t>
               </m:r>
               <m:r>
                 <m:rPr>
                   <m:sty m:val="p"/>
                 </m:rPr>
+                <w:rPr>
+                  <w:color w:val="B3261E"/>
+                </w:rPr>
                 <m:t>+</m:t>
               </m:r>
               <m:sSup>
                 <m:e>
                   <m:r>
+                    <w:rPr>
+                      <w:color w:val="B3261E"/>
+                    </w:rPr>
                     <m:t>3</m:t>
                   </m:r>
                 </m:e>
                 <m:sup>
                   <m:r>
+                    <w:rPr>
+                      <w:color w:val="B3261E"/>
+                    </w:rPr>
                     <m:t>n</m:t>
                   </m:r>
                 </m:sup>
@@ -30705,16 +31860,25 @@
                 <m:rPr>
                   <m:sty m:val="p"/>
                 </m:rPr>
+                <w:rPr>
+                  <w:color w:val="B3261E"/>
+                </w:rPr>
                 <m:t>lim</m:t>
               </m:r>
               <m:sSub>
                 <m:e>
                   <m:r>
+                    <w:rPr>
+                      <w:color w:val="B3261E"/>
+                    </w:rPr>
                     <m:t>u</m:t>
                   </m:r>
                 </m:e>
                 <m:sub>
                   <m:r>
+                    <w:rPr>
+                      <w:color w:val="B3261E"/>
+                    </w:rPr>
                     <m:t>n</m:t>
                   </m:r>
                 </m:sub>
@@ -30723,18 +31887,27 @@
                 <m:rPr>
                   <m:sty m:val="p"/>
                 </m:rPr>
+                <w:rPr>
+                  <w:color w:val="B3261E"/>
+                </w:rPr>
                 <m:t>=</m:t>
               </m:r>
               <m:r>
                 <m:rPr>
                   <m:sty m:val="p"/>
                 </m:rPr>
+                <w:rPr>
+                  <w:color w:val="B3261E"/>
+                </w:rPr>
                 <m:t>+</m:t>
               </m:r>
               <m:r>
                 <m:rPr>
                   <m:sty m:val="p"/>
                 </m:rPr>
+                <w:rPr>
+                  <w:color w:val="B3261E"/>
+                </w:rPr>
                 <m:t>∞</m:t>
               </m:r>
             </m:oMath>
@@ -31363,10 +32536,10 @@
         <w:tblLook w:firstRow="0" w:lastRow="0" w:firstColumn="0" w:lastColumn="0" w:noHBand="0" w:noVBand="0" w:val="0000"/>
       </w:tblPr>
       <w:tblGrid>
-        <w:gridCol w:w="1084"/>
-        <w:gridCol w:w="591"/>
-        <w:gridCol w:w="7004"/>
-        <w:gridCol w:w="1183"/>
+        <w:gridCol w:w="1281"/>
+        <w:gridCol w:w="690"/>
+        <w:gridCol w:w="6511"/>
+        <w:gridCol w:w="1380"/>
       </w:tblGrid>
       <w:tr>
         <w:tc>
@@ -31688,9 +32861,11 @@
               <w:rPr>
                 <w:b/>
                 <w:bCs/>
-                <w:rtl/>
-              </w:rPr>
-              <w:t xml:space="preserve">[مشكلة]</w:t>
+                <w:color w:val="FFFFFF"/>
+                <w:shd w:val="clear" w:color="auto" w:fill="C76B00"/>
+                <w:rtl/>
+              </w:rPr>
+              <w:t xml:space="preserve"> مشكلة </w:t>
             </w:r>
             <w:r>
               <w:rPr>
@@ -32177,9 +33352,11 @@
               <w:rPr>
                 <w:b/>
                 <w:bCs/>
-                <w:rtl/>
-              </w:rPr>
-              <w:t xml:space="preserve">[مناقشة النشاط]</w:t>
+                <w:color w:val="FFFFFF"/>
+                <w:shd w:val="clear" w:color="auto" w:fill="1F4E9C"/>
+                <w:rtl/>
+              </w:rPr>
+              <w:t xml:space="preserve"> مناقشة النشاط </w:t>
             </w:r>
           </w:p>
           <w:p>
@@ -32266,20 +33443,32 @@
               <m:sSub>
                 <m:e>
                   <m:r>
+                    <w:rPr>
+                      <w:color w:val="B3261E"/>
+                    </w:rPr>
                     <m:t>S</m:t>
                   </m:r>
                 </m:e>
                 <m:sub>
                   <m:r>
+                    <w:rPr>
+                      <w:color w:val="B3261E"/>
+                    </w:rPr>
                     <m:t>n</m:t>
                   </m:r>
                   <m:r>
                     <m:rPr>
                       <m:sty m:val="p"/>
                     </m:rPr>
+                    <w:rPr>
+                      <w:color w:val="B3261E"/>
+                    </w:rPr>
                     <m:t>+</m:t>
                   </m:r>
                   <m:r>
+                    <w:rPr>
+                      <w:color w:val="B3261E"/>
+                    </w:rPr>
                     <m:t>1</m:t>
                   </m:r>
                 </m:sub>
@@ -32288,28 +33477,46 @@
                 <m:rPr>
                   <m:sty m:val="p"/>
                 </m:rPr>
+                <w:rPr>
+                  <w:color w:val="B3261E"/>
+                </w:rPr>
                 <m:t>=</m:t>
               </m:r>
               <m:r>
+                <w:rPr>
+                  <w:color w:val="B3261E"/>
+                </w:rPr>
                 <m:t>1</m:t>
               </m:r>
               <m:r>
                 <m:rPr>
                   <m:sty m:val="p"/>
                 </m:rPr>
+                <w:rPr>
+                  <w:color w:val="B3261E"/>
+                </w:rPr>
                 <m:t>,</m:t>
               </m:r>
               <m:r>
+                <w:rPr>
+                  <w:color w:val="B3261E"/>
+                </w:rPr>
                 <m:t>04</m:t>
               </m:r>
               <m:sSub>
                 <m:e>
                   <m:r>
+                    <w:rPr>
+                      <w:color w:val="B3261E"/>
+                    </w:rPr>
                     <m:t>S</m:t>
                   </m:r>
                 </m:e>
                 <m:sub>
                   <m:r>
+                    <w:rPr>
+                      <w:color w:val="B3261E"/>
+                    </w:rPr>
                     <m:t>n</m:t>
                   </m:r>
                 </m:sub>
@@ -32318,9 +33525,15 @@
                 <m:rPr>
                   <m:sty m:val="p"/>
                 </m:rPr>
+                <w:rPr>
+                  <w:color w:val="B3261E"/>
+                </w:rPr>
                 <m:t>+</m:t>
               </m:r>
               <m:r>
+                <w:rPr>
+                  <w:color w:val="B3261E"/>
+                </w:rPr>
                 <m:t>2000</m:t>
               </m:r>
             </m:oMath>
@@ -32503,28 +33716,46 @@
                 <m:t>=</m:t>
               </m:r>
               <m:r>
+                <w:rPr>
+                  <w:color w:val="B3261E"/>
+                </w:rPr>
                 <m:t>1</m:t>
               </m:r>
               <m:r>
                 <m:rPr>
                   <m:sty m:val="p"/>
                 </m:rPr>
+                <w:rPr>
+                  <w:color w:val="B3261E"/>
+                </w:rPr>
                 <m:t>,</m:t>
               </m:r>
               <m:r>
+                <w:rPr>
+                  <w:color w:val="B3261E"/>
+                </w:rPr>
                 <m:t>04</m:t>
               </m:r>
               <m:r>
+                <w:rPr>
+                  <w:color w:val="B3261E"/>
+                </w:rPr>
                 <m:t> </m:t>
               </m:r>
               <m:sSub>
                 <m:e>
                   <m:r>
+                    <w:rPr>
+                      <w:color w:val="B3261E"/>
+                    </w:rPr>
                     <m:t>v</m:t>
                   </m:r>
                 </m:e>
                 <m:sub>
                   <m:r>
+                    <w:rPr>
+                      <w:color w:val="B3261E"/>
+                    </w:rPr>
                     <m:t>n</m:t>
                   </m:r>
                 </m:sub>
@@ -32695,11 +33926,17 @@
               <m:sSub>
                 <m:e>
                   <m:r>
+                    <w:rPr>
+                      <w:color w:val="B3261E"/>
+                    </w:rPr>
                     <m:t>S</m:t>
                   </m:r>
                 </m:e>
                 <m:sub>
                   <m:r>
+                    <w:rPr>
+                      <w:color w:val="B3261E"/>
+                    </w:rPr>
                     <m:t>n</m:t>
                   </m:r>
                 </m:sub>
@@ -32708,34 +33945,55 @@
                 <m:rPr>
                   <m:sty m:val="p"/>
                 </m:rPr>
+                <w:rPr>
+                  <w:color w:val="B3261E"/>
+                </w:rPr>
                 <m:t>=</m:t>
               </m:r>
               <m:r>
+                <w:rPr>
+                  <w:color w:val="B3261E"/>
+                </w:rPr>
                 <m:t>60000</m:t>
               </m:r>
               <m:r>
                 <m:rPr>
                   <m:sty m:val="p"/>
                 </m:rPr>
+                <w:rPr>
+                  <w:color w:val="B3261E"/>
+                </w:rPr>
                 <m:t>×</m:t>
               </m:r>
               <m:r>
+                <w:rPr>
+                  <w:color w:val="B3261E"/>
+                </w:rPr>
                 <m:t>1</m:t>
               </m:r>
               <m:r>
                 <m:rPr>
                   <m:sty m:val="p"/>
                 </m:rPr>
+                <w:rPr>
+                  <w:color w:val="B3261E"/>
+                </w:rPr>
                 <m:t>,</m:t>
               </m:r>
               <m:sSup>
                 <m:e>
                   <m:r>
+                    <w:rPr>
+                      <w:color w:val="B3261E"/>
+                    </w:rPr>
                     <m:t>04</m:t>
                   </m:r>
                 </m:e>
                 <m:sup>
                   <m:r>
+                    <w:rPr>
+                      <w:color w:val="B3261E"/>
+                    </w:rPr>
                     <m:t>n</m:t>
                   </m:r>
                 </m:sup>
@@ -32744,9 +34002,15 @@
                 <m:rPr>
                   <m:sty m:val="p"/>
                 </m:rPr>
+                <w:rPr>
+                  <w:color w:val="B3261E"/>
+                </w:rPr>
                 <m:t>−</m:t>
               </m:r>
               <m:r>
+                <w:rPr>
+                  <w:color w:val="B3261E"/>
+                </w:rPr>
                 <m:t>50000</m:t>
               </m:r>
             </m:oMath>
@@ -32824,15 +34088,24 @@
                 <m:t>≈</m:t>
               </m:r>
               <m:r>
+                <w:rPr>
+                  <w:color w:val="B3261E"/>
+                </w:rPr>
                 <m:t>22999</m:t>
               </m:r>
               <m:r>
                 <m:rPr>
                   <m:sty m:val="p"/>
                 </m:rPr>
+                <w:rPr>
+                  <w:color w:val="B3261E"/>
+                </w:rPr>
                 <m:t>,</m:t>
               </m:r>
               <m:r>
+                <w:rPr>
+                  <w:color w:val="B3261E"/>
+                </w:rPr>
                 <m:t>17</m:t>
               </m:r>
             </m:oMath>
@@ -32913,9 +34186,11 @@
               <w:rPr>
                 <w:b/>
                 <w:bCs/>
-                <w:rtl/>
-              </w:rPr>
-              <w:t xml:space="preserve">[خطوات حل مشكلة بالمتتاليات]</w:t>
+                <w:color w:val="FFFFFF"/>
+                <w:shd w:val="clear" w:color="auto" w:fill="6A1B9A"/>
+                <w:rtl/>
+              </w:rPr>
+              <w:t xml:space="preserve"> خطوات حل مشكلة بالمتتاليات </w:t>
             </w:r>
           </w:p>
           <w:p>
@@ -33057,9 +34332,11 @@
               <w:rPr>
                 <w:b/>
                 <w:bCs/>
-                <w:rtl/>
-              </w:rPr>
-              <w:t xml:space="preserve">[حذار]</w:t>
+                <w:color w:val="FFFFFF"/>
+                <w:shd w:val="clear" w:color="auto" w:fill="B3261E"/>
+                <w:rtl/>
+              </w:rPr>
+              <w:t xml:space="preserve"> حذار </w:t>
             </w:r>
             <w:r>
               <w:rPr>
@@ -33132,9 +34409,11 @@
               <w:rPr>
                 <w:b/>
                 <w:bCs/>
-                <w:rtl/>
-              </w:rPr>
-              <w:t xml:space="preserve">[تمرين تطبيقي]</w:t>
+                <w:color w:val="FFFFFF"/>
+                <w:shd w:val="clear" w:color="auto" w:fill="6A1B9A"/>
+                <w:rtl/>
+              </w:rPr>
+              <w:t xml:space="preserve"> تمرين تطبيقي </w:t>
             </w:r>
           </w:p>
           <w:p>
@@ -33681,9 +34960,11 @@
               <w:rPr>
                 <w:b/>
                 <w:bCs/>
-                <w:rtl/>
-              </w:rPr>
-              <w:t xml:space="preserve">[حل التمرين التطبيقي]</w:t>
+                <w:color w:val="FFFFFF"/>
+                <w:shd w:val="clear" w:color="auto" w:fill="C76B00"/>
+                <w:rtl/>
+              </w:rPr>
+              <w:t xml:space="preserve"> حل التمرين التطبيقي </w:t>
             </w:r>
           </w:p>
           <w:p>
@@ -33767,20 +35048,32 @@
               <m:sSub>
                 <m:e>
                   <m:r>
+                    <w:rPr>
+                      <w:color w:val="B3261E"/>
+                    </w:rPr>
                     <m:t>P</m:t>
                   </m:r>
                 </m:e>
                 <m:sub>
                   <m:r>
+                    <w:rPr>
+                      <w:color w:val="B3261E"/>
+                    </w:rPr>
                     <m:t>n</m:t>
                   </m:r>
                   <m:r>
                     <m:rPr>
                       <m:sty m:val="p"/>
                     </m:rPr>
+                    <w:rPr>
+                      <w:color w:val="B3261E"/>
+                    </w:rPr>
                     <m:t>+</m:t>
                   </m:r>
                   <m:r>
+                    <w:rPr>
+                      <w:color w:val="B3261E"/>
+                    </w:rPr>
                     <m:t>1</m:t>
                   </m:r>
                 </m:sub>
@@ -33789,28 +35082,46 @@
                 <m:rPr>
                   <m:sty m:val="p"/>
                 </m:rPr>
+                <w:rPr>
+                  <w:color w:val="B3261E"/>
+                </w:rPr>
                 <m:t>=</m:t>
               </m:r>
               <m:r>
+                <w:rPr>
+                  <w:color w:val="B3261E"/>
+                </w:rPr>
                 <m:t>0</m:t>
               </m:r>
               <m:r>
                 <m:rPr>
                   <m:sty m:val="p"/>
                 </m:rPr>
+                <w:rPr>
+                  <w:color w:val="B3261E"/>
+                </w:rPr>
                 <m:t>,</m:t>
               </m:r>
               <m:r>
+                <w:rPr>
+                  <w:color w:val="B3261E"/>
+                </w:rPr>
                 <m:t>98</m:t>
               </m:r>
               <m:sSub>
                 <m:e>
                   <m:r>
+                    <w:rPr>
+                      <w:color w:val="B3261E"/>
+                    </w:rPr>
                     <m:t>P</m:t>
                   </m:r>
                 </m:e>
                 <m:sub>
                   <m:r>
+                    <w:rPr>
+                      <w:color w:val="B3261E"/>
+                    </w:rPr>
                     <m:t>n</m:t>
                   </m:r>
                 </m:sub>
@@ -33819,9 +35130,15 @@
                 <m:rPr>
                   <m:sty m:val="p"/>
                 </m:rPr>
+                <w:rPr>
+                  <w:color w:val="B3261E"/>
+                </w:rPr>
                 <m:t>+</m:t>
               </m:r>
               <m:r>
+                <w:rPr>
+                  <w:color w:val="B3261E"/>
+                </w:rPr>
                 <m:t>300</m:t>
               </m:r>
             </m:oMath>
@@ -33891,15 +35208,24 @@
             </w:r>
             <m:oMath>
               <m:r>
+                <w:rPr>
+                  <w:color w:val="B3261E"/>
+                </w:rPr>
                 <m:t>l</m:t>
               </m:r>
               <m:r>
                 <m:rPr>
                   <m:sty m:val="p"/>
                 </m:rPr>
+                <w:rPr>
+                  <w:color w:val="B3261E"/>
+                </w:rPr>
                 <m:t>=</m:t>
               </m:r>
               <m:r>
+                <w:rPr>
+                  <w:color w:val="B3261E"/>
+                </w:rPr>
                 <m:t>15000</m:t>
               </m:r>
             </m:oMath>
@@ -34047,28 +35373,46 @@
                 <m:t>=</m:t>
               </m:r>
               <m:r>
+                <w:rPr>
+                  <w:color w:val="B3261E"/>
+                </w:rPr>
                 <m:t>0</m:t>
               </m:r>
               <m:r>
                 <m:rPr>
                   <m:sty m:val="p"/>
                 </m:rPr>
+                <w:rPr>
+                  <w:color w:val="B3261E"/>
+                </w:rPr>
                 <m:t>,</m:t>
               </m:r>
               <m:r>
+                <w:rPr>
+                  <w:color w:val="B3261E"/>
+                </w:rPr>
                 <m:t>98</m:t>
               </m:r>
               <m:r>
+                <w:rPr>
+                  <w:color w:val="B3261E"/>
+                </w:rPr>
                 <m:t> </m:t>
               </m:r>
               <m:sSub>
                 <m:e>
                   <m:r>
+                    <w:rPr>
+                      <w:color w:val="B3261E"/>
+                    </w:rPr>
                     <m:t>Q</m:t>
                   </m:r>
                 </m:e>
                 <m:sub>
                   <m:r>
+                    <w:rPr>
+                      <w:color w:val="B3261E"/>
+                    </w:rPr>
                     <m:t>n</m:t>
                   </m:r>
                 </m:sub>
@@ -34145,11 +35489,17 @@
               <m:sSub>
                 <m:e>
                   <m:r>
+                    <w:rPr>
+                      <w:color w:val="B3261E"/>
+                    </w:rPr>
                     <m:t>P</m:t>
                   </m:r>
                 </m:e>
                 <m:sub>
                   <m:r>
+                    <w:rPr>
+                      <w:color w:val="B3261E"/>
+                    </w:rPr>
                     <m:t>n</m:t>
                   </m:r>
                 </m:sub>
@@ -34158,43 +35508,70 @@
                 <m:rPr>
                   <m:sty m:val="p"/>
                 </m:rPr>
+                <w:rPr>
+                  <w:color w:val="B3261E"/>
+                </w:rPr>
                 <m:t>=</m:t>
               </m:r>
               <m:r>
+                <w:rPr>
+                  <w:color w:val="B3261E"/>
+                </w:rPr>
                 <m:t>15000</m:t>
               </m:r>
               <m:r>
                 <m:rPr>
                   <m:sty m:val="p"/>
                 </m:rPr>
+                <w:rPr>
+                  <w:color w:val="B3261E"/>
+                </w:rPr>
                 <m:t>+</m:t>
               </m:r>
               <m:r>
+                <w:rPr>
+                  <w:color w:val="B3261E"/>
+                </w:rPr>
                 <m:t>5000</m:t>
               </m:r>
               <m:r>
                 <m:rPr>
                   <m:sty m:val="p"/>
                 </m:rPr>
+                <w:rPr>
+                  <w:color w:val="B3261E"/>
+                </w:rPr>
                 <m:t>×</m:t>
               </m:r>
               <m:r>
+                <w:rPr>
+                  <w:color w:val="B3261E"/>
+                </w:rPr>
                 <m:t>0</m:t>
               </m:r>
               <m:r>
                 <m:rPr>
                   <m:sty m:val="p"/>
                 </m:rPr>
+                <w:rPr>
+                  <w:color w:val="B3261E"/>
+                </w:rPr>
                 <m:t>,</m:t>
               </m:r>
               <m:sSup>
                 <m:e>
                   <m:r>
+                    <w:rPr>
+                      <w:color w:val="B3261E"/>
+                    </w:rPr>
                     <m:t>98</m:t>
                   </m:r>
                 </m:e>
                 <m:sup>
                   <m:r>
+                    <w:rPr>
+                      <w:color w:val="B3261E"/>
+                    </w:rPr>
                     <m:t>n</m:t>
                   </m:r>
                 </m:sup>
@@ -34273,16 +35650,25 @@
                 <m:rPr>
                   <m:sty m:val="p"/>
                 </m:rPr>
+                <w:rPr>
+                  <w:color w:val="B3261E"/>
+                </w:rPr>
                 <m:t>lim</m:t>
               </m:r>
               <m:sSub>
                 <m:e>
                   <m:r>
+                    <w:rPr>
+                      <w:color w:val="B3261E"/>
+                    </w:rPr>
                     <m:t>P</m:t>
                   </m:r>
                 </m:e>
                 <m:sub>
                   <m:r>
+                    <w:rPr>
+                      <w:color w:val="B3261E"/>
+                    </w:rPr>
                     <m:t>n</m:t>
                   </m:r>
                 </m:sub>
@@ -34291,9 +35677,15 @@
                 <m:rPr>
                   <m:sty m:val="p"/>
                 </m:rPr>
+                <w:rPr>
+                  <w:color w:val="B3261E"/>
+                </w:rPr>
                 <m:t>=</m:t>
               </m:r>
               <m:r>
+                <w:rPr>
+                  <w:color w:val="B3261E"/>
+                </w:rPr>
                 <m:t>15000</m:t>
               </m:r>
             </m:oMath>
@@ -34896,8 +36288,8 @@
     </w:pPr>
     <w:rPr>
       <w:rFonts w:ascii="Amiri" w:cs="Amiri" w:eastAsia="Amiri" w:hAnsi="Amiri"/>
-      <w:sz w:val="26"/>
-      <w:szCs w:val="26"/>
+      <w:sz w:val="28"/>
+      <w:szCs w:val="28"/>
       <w:lang w:bidi="ar-DZ" w:val="fr-FR"/>
     </w:rPr>
   </w:style>

</xml_diff>